<commit_message>
Update the brief and file structure notes for sign-in and custodian batches
Bring both documents up to date with salted leaves, custodian login,
the ledger append token and per-custodian batches.

Co-Authored-By: Claude Opus 5.5 <noreply@anthropic.com>
</commit_message>
<xml_diff>
--- a/context/ProofChain_Project_Brief.docx
+++ b/context/ProofChain_Project_Brief.docx
@@ -43,7 +43,7 @@
           <w:sz w:val="20"/>
           <w:szCs w:val="20"/>
         </w:rPr>
-        <w:t xml:space="preserve">Project brief for problem B-01  |  Domain 3: Blockchain and Decentralized Trust  |  11 October 2026, revised after all six build stages</w:t>
+        <w:t xml:space="preserve">Project brief for problem B-01  |  Domain 3: Blockchain and Decentralized Trust  |  11 October 2026, revised after all six build stages, salted leaves and custodian sign-in</w:t>
       </w:r>
     </w:p>
     <w:p>
@@ -51,7 +51,7 @@
         <w:spacing w:after="140" w:line="288"/>
       </w:pPr>
       <w:r>
-        <w:t xml:space="preserve">This brief explains the problem, the concepts you need, what the problem statement really asks for, how the system flows, how we plan to build it, and which extra features would make the project stand out. It was written before any code existed and has been revised now that all six build stages are complete. Where the working code settled a detail that the first version left open, the brief now states what was built.</w:t>
+        <w:t xml:space="preserve">This brief explains the problem, the concepts you need, what the problem statement really asks for, how the system flows, how we plan to build it, and which extra features would make the project stand out. It was written before any code existed and has been revised now that all six build stages are complete. Where the working code settled a detail that the first version left open, the brief now states what was built. Three things were added after the six stages: salted leaves, custodian sign-in with a token on the ledger's append endpoint, and one batch per custodian.</w:t>
       </w:r>
     </w:p>
     <w:p>
@@ -532,7 +532,7 @@
                 <w:sz w:val="19"/>
                 <w:szCs w:val="19"/>
               </w:rPr>
-              <w:t xml:space="preserve">Separate process with its own signing key. Stores roots in an append-only hash chain.</w:t>
+              <w:t xml:space="preserve">Separate process with its own signing key. Stores roots in an append-only hash chain. Appending needs a shared token; reading is open to everyone.</w:t>
             </w:r>
           </w:p>
         </w:tc>
@@ -595,7 +595,7 @@
                 <w:sz w:val="19"/>
                 <w:szCs w:val="19"/>
               </w:rPr>
-              <w:t xml:space="preserve">Upload, confirm metadata, seal batches, download proofs, run a self-audit.</w:t>
+              <w:t xml:space="preserve">Staff sign in, then upload, confirm metadata, seal their own batches, download proofs and run a self-audit. The Verify page needs no account.</w:t>
             </w:r>
           </w:p>
         </w:tc>
@@ -1273,6 +1273,195 @@
           </w:p>
         </w:tc>
       </w:tr>
+      <w:tr>
+        <w:trPr>
+          <w:cantSplit/>
+        </w:trPr>
+        <w:tc>
+          <w:tcPr>
+            <w:tcW w:type="dxa" w:w="4500"/>
+            <w:tcBorders>
+              <w:top w:val="single" w:color="C9D1DC" w:sz="4"/>
+              <w:left w:val="single" w:color="C9D1DC" w:sz="4"/>
+              <w:bottom w:val="single" w:color="C9D1DC" w:sz="4"/>
+              <w:right w:val="single" w:color="C9D1DC" w:sz="4"/>
+            </w:tcBorders>
+            <w:tcMar>
+              <w:top w:type="dxa" w:w="70"/>
+              <w:left w:type="dxa" w:w="100"/>
+              <w:bottom w:type="dxa" w:w="70"/>
+              <w:right w:type="dxa" w:w="100"/>
+            </w:tcMar>
+          </w:tcPr>
+          <w:p>
+            <w:pPr>
+              <w:spacing w:after="40" w:line="260"/>
+            </w:pPr>
+            <w:r>
+              <w:rPr>
+                <w:sz w:val="19"/>
+                <w:szCs w:val="19"/>
+              </w:rPr>
+              <w:t xml:space="preserve">Salted leaves</w:t>
+            </w:r>
+          </w:p>
+        </w:tc>
+        <w:tc>
+          <w:tcPr>
+            <w:tcW w:type="dxa" w:w="4526"/>
+            <w:tcBorders>
+              <w:top w:val="single" w:color="C9D1DC" w:sz="4"/>
+              <w:left w:val="single" w:color="C9D1DC" w:sz="4"/>
+              <w:bottom w:val="single" w:color="C9D1DC" w:sz="4"/>
+              <w:right w:val="single" w:color="C9D1DC" w:sz="4"/>
+            </w:tcBorders>
+            <w:tcMar>
+              <w:top w:type="dxa" w:w="70"/>
+              <w:left w:type="dxa" w:w="100"/>
+              <w:bottom w:type="dxa" w:w="70"/>
+              <w:right w:type="dxa" w:w="100"/>
+            </w:tcMar>
+          </w:tcPr>
+          <w:p>
+            <w:pPr>
+              <w:spacing w:after="40" w:line="260"/>
+            </w:pPr>
+            <w:r>
+              <w:rPr>
+                <w:sz w:val="19"/>
+                <w:szCs w:val="19"/>
+              </w:rPr>
+              <w:t xml:space="preserve">Built and tested (after stage 6)</w:t>
+            </w:r>
+          </w:p>
+        </w:tc>
+      </w:tr>
+      <w:tr>
+        <w:trPr>
+          <w:cantSplit/>
+        </w:trPr>
+        <w:tc>
+          <w:tcPr>
+            <w:tcW w:type="dxa" w:w="4500"/>
+            <w:tcBorders>
+              <w:top w:val="single" w:color="C9D1DC" w:sz="4"/>
+              <w:left w:val="single" w:color="C9D1DC" w:sz="4"/>
+              <w:bottom w:val="single" w:color="C9D1DC" w:sz="4"/>
+              <w:right w:val="single" w:color="C9D1DC" w:sz="4"/>
+            </w:tcBorders>
+            <w:tcMar>
+              <w:top w:type="dxa" w:w="70"/>
+              <w:left w:type="dxa" w:w="100"/>
+              <w:bottom w:type="dxa" w:w="70"/>
+              <w:right w:type="dxa" w:w="100"/>
+            </w:tcMar>
+          </w:tcPr>
+          <w:p>
+            <w:pPr>
+              <w:spacing w:after="40" w:line="260"/>
+            </w:pPr>
+            <w:r>
+              <w:rPr>
+                <w:sz w:val="19"/>
+                <w:szCs w:val="19"/>
+              </w:rPr>
+              <w:t xml:space="preserve">Custodian sign-in and the ledger append token</w:t>
+            </w:r>
+          </w:p>
+        </w:tc>
+        <w:tc>
+          <w:tcPr>
+            <w:tcW w:type="dxa" w:w="4526"/>
+            <w:tcBorders>
+              <w:top w:val="single" w:color="C9D1DC" w:sz="4"/>
+              <w:left w:val="single" w:color="C9D1DC" w:sz="4"/>
+              <w:bottom w:val="single" w:color="C9D1DC" w:sz="4"/>
+              <w:right w:val="single" w:color="C9D1DC" w:sz="4"/>
+            </w:tcBorders>
+            <w:tcMar>
+              <w:top w:type="dxa" w:w="70"/>
+              <w:left w:type="dxa" w:w="100"/>
+              <w:bottom w:type="dxa" w:w="70"/>
+              <w:right w:type="dxa" w:w="100"/>
+            </w:tcMar>
+          </w:tcPr>
+          <w:p>
+            <w:pPr>
+              <w:spacing w:after="40" w:line="260"/>
+            </w:pPr>
+            <w:r>
+              <w:rPr>
+                <w:sz w:val="19"/>
+                <w:szCs w:val="19"/>
+              </w:rPr>
+              <w:t xml:space="preserve">Built and tested (after stage 6)</w:t>
+            </w:r>
+          </w:p>
+        </w:tc>
+      </w:tr>
+      <w:tr>
+        <w:trPr>
+          <w:cantSplit/>
+        </w:trPr>
+        <w:tc>
+          <w:tcPr>
+            <w:tcW w:type="dxa" w:w="4500"/>
+            <w:tcBorders>
+              <w:top w:val="single" w:color="C9D1DC" w:sz="4"/>
+              <w:left w:val="single" w:color="C9D1DC" w:sz="4"/>
+              <w:bottom w:val="single" w:color="C9D1DC" w:sz="4"/>
+              <w:right w:val="single" w:color="C9D1DC" w:sz="4"/>
+            </w:tcBorders>
+            <w:tcMar>
+              <w:top w:type="dxa" w:w="70"/>
+              <w:left w:type="dxa" w:w="100"/>
+              <w:bottom w:type="dxa" w:w="70"/>
+              <w:right w:type="dxa" w:w="100"/>
+            </w:tcMar>
+          </w:tcPr>
+          <w:p>
+            <w:pPr>
+              <w:spacing w:after="40" w:line="260"/>
+            </w:pPr>
+            <w:r>
+              <w:rPr>
+                <w:sz w:val="19"/>
+                <w:szCs w:val="19"/>
+              </w:rPr>
+              <w:t xml:space="preserve">Batches per custodian, with an admin role</w:t>
+            </w:r>
+          </w:p>
+        </w:tc>
+        <w:tc>
+          <w:tcPr>
+            <w:tcW w:type="dxa" w:w="4526"/>
+            <w:tcBorders>
+              <w:top w:val="single" w:color="C9D1DC" w:sz="4"/>
+              <w:left w:val="single" w:color="C9D1DC" w:sz="4"/>
+              <w:bottom w:val="single" w:color="C9D1DC" w:sz="4"/>
+              <w:right w:val="single" w:color="C9D1DC" w:sz="4"/>
+            </w:tcBorders>
+            <w:tcMar>
+              <w:top w:type="dxa" w:w="70"/>
+              <w:left w:type="dxa" w:w="100"/>
+              <w:bottom w:type="dxa" w:w="70"/>
+              <w:right w:type="dxa" w:w="100"/>
+            </w:tcMar>
+          </w:tcPr>
+          <w:p>
+            <w:pPr>
+              <w:spacing w:after="40" w:line="260"/>
+            </w:pPr>
+            <w:r>
+              <w:rPr>
+                <w:sz w:val="19"/>
+                <w:szCs w:val="19"/>
+              </w:rPr>
+              <w:t xml:space="preserve">Built and tested (after stage 6)</w:t>
+            </w:r>
+          </w:p>
+        </w:tc>
+      </w:tr>
     </w:tbl>
     <w:p>
       <w:pPr>
@@ -1284,7 +1473,7 @@
         <w:spacing w:after="140" w:line="288"/>
       </w:pPr>
       <w:r>
-        <w:t xml:space="preserve">The automated test suite has 500 passing tests. The whole base build described in this brief now exists. Of the standout features in Section 8, the static browser verifier is built and the tamper demo exists as a command-line script; the rest are not built.</w:t>
+        <w:t xml:space="preserve">The automated test suite has 697 passing tests. The whole base build described in this brief now exists. Of the standout features in Section 8, the static browser verifier and salted leaves are built, and the tamper demo exists as a command-line script; the rest are not built.</w:t>
       </w:r>
     </w:p>
     <w:p>
@@ -1306,6 +1495,27 @@
       </w:r>
       <w:r>
         <w:t xml:space="preserve">Verification proves that a document matches a reference registered at a known point in the ledger. It does not prove who created the document or that what it says is true. The product must say this wherever it shows a result.</w:t>
+      </w:r>
+    </w:p>
+    <w:p>
+      <w:pPr>
+        <w:pBdr>
+          <w:left w:val="single" w:color="0F766E" w:sz="18" w:space="8"/>
+        </w:pBdr>
+        <w:shd w:fill="E8F3F1" w:val="clear"/>
+        <w:spacing w:after="200" w:before="120" w:line="288"/>
+        <w:ind w:left="160" w:right="160"/>
+      </w:pPr>
+      <w:r>
+        <w:rPr>
+          <w:b/>
+          <w:bCs/>
+          <w:color w:val="0F766E"/>
+        </w:rPr>
+        <w:t xml:space="preserve">What signing in means.  </w:t>
+      </w:r>
+      <w:r>
+        <w:t xml:space="preserve">Staff sign in so that each confirmation and each seal names the account that made it. That is accountability inside the registry. It does not make a record more trustworthy and it does not change the trust model: the guarantee still comes from the published root and the independent verifier. Verifying never needs an account.</w:t>
       </w:r>
     </w:p>
     <w:p>
@@ -2676,7 +2886,7 @@
                 <w:sz w:val="19"/>
                 <w:szCs w:val="19"/>
               </w:rPr>
-              <w:t xml:space="preserve">Suggestion then confirmation gate. Verifier has no AI import. Metadata is not hashed into the leaf.</w:t>
+              <w:t xml:space="preserve">Suggestion then confirmation gate, recorded under the signed-in account. Verifier has no AI import. Metadata is not hashed into the leaf.</w:t>
             </w:r>
           </w:p>
         </w:tc>
@@ -4499,6 +4709,52 @@
     </w:p>
     <w:p>
       <w:pPr>
+        <w:pStyle w:val="Heading3"/>
+      </w:pPr>
+      <w:r>
+        <w:t xml:space="preserve">Salted leaves</w:t>
+      </w:r>
+    </w:p>
+    <w:p>
+      <w:pPr>
+        <w:spacing w:after="140" w:line="288"/>
+      </w:pPr>
+      <w:r>
+        <w:t xml:space="preserve">The rules above take a 32-byte </w:t>
+      </w:r>
+      <w:r>
+        <w:rPr>
+          <w:rFonts w:ascii="Consolas" w:cs="Consolas" w:eastAsia="Consolas" w:hAnsi="Consolas"/>
+          <w:sz w:val="20"/>
+          <w:szCs w:val="20"/>
+        </w:rPr>
+        <w:t xml:space="preserve">leaf value</w:t>
+      </w:r>
+      <w:r>
+        <w:t xml:space="preserve"> for each record. In the simplest form, used in the figures and worked examples of this section, the leaf value is the document's fingerprint. The built system adds one step: every record is given a random 32-byte salt when it is uploaded, and its leaf value is </w:t>
+      </w:r>
+      <w:r>
+        <w:rPr>
+          <w:rFonts w:ascii="Consolas" w:cs="Consolas" w:eastAsia="Consolas" w:hAnsi="Consolas"/>
+          <w:sz w:val="20"/>
+          <w:szCs w:val="20"/>
+        </w:rPr>
+        <w:t xml:space="preserve">SHA-256(0x02 || salt || fingerprint)</w:t>
+      </w:r>
+      <w:r>
+        <w:t xml:space="preserve">. The 0x02 prefix keeps a salted value from ever being read as a leaf or a node.</w:t>
+      </w:r>
+    </w:p>
+    <w:p>
+      <w:pPr>
+        <w:spacing w:after="140" w:line="288"/>
+      </w:pPr>
+      <w:r>
+        <w:t xml:space="preserve">Salting does two things. Two registrations of the same content become two different leaves, each with its own proof, so every registration is distinct. And a sibling hash in one holder's proof can no longer be matched against a guess at another holder's document, because the guesser does not have that record's salt. The tree, the root, the proof path and the ledger work exactly as described; only the value at the bottom changes.</w:t>
+      </w:r>
+    </w:p>
+    <w:p>
+      <w:pPr>
         <w:pStyle w:val="Heading2"/>
       </w:pPr>
       <w:r>
@@ -8746,7 +9002,43 @@
         <w:spacing w:after="140" w:line="288"/>
       </w:pPr>
       <w:r>
-        <w:t xml:space="preserve">The two services start in separate terminals. Start the ledger first: the registry needs it to seal a batch.</w:t>
+        <w:t xml:space="preserve">Create a staff account first. There is no sign-up page: an account is made on the machine that runs the registry, and the password is asked for, never passed as an argument. Add </w:t>
+      </w:r>
+      <w:r>
+        <w:rPr>
+          <w:rFonts w:ascii="Consolas" w:cs="Consolas" w:eastAsia="Consolas" w:hAnsi="Consolas"/>
+          <w:sz w:val="20"/>
+          <w:szCs w:val="20"/>
+        </w:rPr>
+        <w:t xml:space="preserve">--admin</w:t>
+      </w:r>
+      <w:r>
+        <w:t xml:space="preserve"> for an account that may seal any custodian's batch.</w:t>
+      </w:r>
+    </w:p>
+    <w:p>
+      <w:pPr>
+        <w:keepNext w:val="false"/>
+        <w:keepLines/>
+        <w:shd w:fill="F3F5F8" w:val="clear"/>
+        <w:spacing w:after="180" w:before="60" w:line="250"/>
+        <w:ind w:left="120" w:right="120"/>
+      </w:pPr>
+      <w:r>
+        <w:rPr>
+          <w:rFonts w:ascii="Consolas" w:cs="Consolas" w:eastAsia="Consolas" w:hAnsi="Consolas"/>
+          <w:sz w:val="17"/>
+          <w:szCs w:val="17"/>
+        </w:rPr>
+        <w:t xml:space="preserve">python -m proofchain.registry.staff add &lt;username&gt;</w:t>
+      </w:r>
+    </w:p>
+    <w:p>
+      <w:pPr>
+        <w:spacing w:after="140" w:line="288"/>
+      </w:pPr>
+      <w:r>
+        <w:t xml:space="preserve">The two services start in separate terminals, with the same ledger token set in both. Start the ledger first: the registry needs it to seal a batch.</w:t>
       </w:r>
     </w:p>
     <w:p>
@@ -8755,6 +9047,23 @@
         <w:keepLines/>
         <w:shd w:fill="F3F5F8" w:val="clear"/>
         <w:spacing w:after="0" w:before="60" w:line="250"/>
+        <w:ind w:left="120" w:right="120"/>
+      </w:pPr>
+      <w:r>
+        <w:rPr>
+          <w:rFonts w:ascii="Consolas" w:cs="Consolas" w:eastAsia="Consolas" w:hAnsi="Consolas"/>
+          <w:sz w:val="17"/>
+          <w:szCs w:val="17"/>
+        </w:rPr>
+        <w:t xml:space="preserve">$env:PROOFCHAIN_LEDGER_TOKEN = "&lt;a long random string&gt;"</w:t>
+      </w:r>
+    </w:p>
+    <w:p>
+      <w:pPr>
+        <w:keepNext/>
+        <w:keepLines/>
+        <w:shd w:fill="F3F5F8" w:val="clear"/>
+        <w:spacing w:after="0" w:before="0" w:line="250"/>
         <w:ind w:left="120" w:right="120"/>
       </w:pPr>
       <w:r>
@@ -8768,6 +9077,40 @@
     </w:p>
     <w:p>
       <w:pPr>
+        <w:keepNext/>
+        <w:keepLines/>
+        <w:shd w:fill="F3F5F8" w:val="clear"/>
+        <w:spacing w:after="0" w:before="0" w:line="250"/>
+        <w:ind w:left="120" w:right="120"/>
+      </w:pPr>
+      <w:r>
+        <w:rPr>
+          <w:rFonts w:ascii="Consolas" w:cs="Consolas" w:eastAsia="Consolas" w:hAnsi="Consolas"/>
+          <w:sz w:val="17"/>
+          <w:szCs w:val="17"/>
+        </w:rPr>
+        <w:t xml:space="preserve"> </w:t>
+      </w:r>
+    </w:p>
+    <w:p>
+      <w:pPr>
+        <w:keepNext/>
+        <w:keepLines/>
+        <w:shd w:fill="F3F5F8" w:val="clear"/>
+        <w:spacing w:after="0" w:before="0" w:line="250"/>
+        <w:ind w:left="120" w:right="120"/>
+      </w:pPr>
+      <w:r>
+        <w:rPr>
+          <w:rFonts w:ascii="Consolas" w:cs="Consolas" w:eastAsia="Consolas" w:hAnsi="Consolas"/>
+          <w:sz w:val="17"/>
+          <w:szCs w:val="17"/>
+        </w:rPr>
+        <w:t xml:space="preserve">$env:PROOFCHAIN_LEDGER_TOKEN = "&lt;the same string&gt;"</w:t>
+      </w:r>
+    </w:p>
+    <w:p>
+      <w:pPr>
         <w:keepNext w:val="false"/>
         <w:keepLines/>
         <w:shd w:fill="F3F5F8" w:val="clear"/>
@@ -8799,7 +9142,7 @@
         <w:t xml:space="preserve">.env.example</w:t>
       </w:r>
       <w:r>
-        <w:t xml:space="preserve">. Each has a default, so nothing needs to be set for a local run.</w:t>
+        <w:t xml:space="preserve">. Each has a default except the ledger token. A ledger started without it still serves every read, but refuses appends and says why, so no batch can be sealed until it is set.</w:t>
       </w:r>
     </w:p>
     <w:tbl>
@@ -9482,6 +9825,200 @@
                 <w:szCs w:val="19"/>
               </w:rPr>
               <w:t xml:space="preserve">AI helper: which Claude model to ask</w:t>
+            </w:r>
+          </w:p>
+        </w:tc>
+      </w:tr>
+      <w:tr>
+        <w:trPr>
+          <w:cantSplit/>
+        </w:trPr>
+        <w:tc>
+          <w:tcPr>
+            <w:tcW w:type="dxa" w:w="3300"/>
+            <w:tcBorders>
+              <w:top w:val="single" w:color="C9D1DC" w:sz="4"/>
+              <w:left w:val="single" w:color="C9D1DC" w:sz="4"/>
+              <w:bottom w:val="single" w:color="C9D1DC" w:sz="4"/>
+              <w:right w:val="single" w:color="C9D1DC" w:sz="4"/>
+            </w:tcBorders>
+            <w:tcMar>
+              <w:top w:type="dxa" w:w="70"/>
+              <w:left w:type="dxa" w:w="100"/>
+              <w:bottom w:type="dxa" w:w="70"/>
+              <w:right w:type="dxa" w:w="100"/>
+            </w:tcMar>
+          </w:tcPr>
+          <w:p>
+            <w:pPr>
+              <w:spacing w:after="40" w:line="260"/>
+            </w:pPr>
+            <w:r>
+              <w:rPr>
+                <w:rFonts w:ascii="Consolas" w:cs="Consolas" w:eastAsia="Consolas" w:hAnsi="Consolas"/>
+                <w:sz w:val="17"/>
+                <w:szCs w:val="17"/>
+              </w:rPr>
+              <w:t xml:space="preserve">PROOFCHAIN_LEDGER_TOKEN</w:t>
+            </w:r>
+          </w:p>
+        </w:tc>
+        <w:tc>
+          <w:tcPr>
+            <w:tcW w:type="dxa" w:w="2600"/>
+            <w:tcBorders>
+              <w:top w:val="single" w:color="C9D1DC" w:sz="4"/>
+              <w:left w:val="single" w:color="C9D1DC" w:sz="4"/>
+              <w:bottom w:val="single" w:color="C9D1DC" w:sz="4"/>
+              <w:right w:val="single" w:color="C9D1DC" w:sz="4"/>
+            </w:tcBorders>
+            <w:tcMar>
+              <w:top w:type="dxa" w:w="70"/>
+              <w:left w:type="dxa" w:w="100"/>
+              <w:bottom w:type="dxa" w:w="70"/>
+              <w:right w:type="dxa" w:w="100"/>
+            </w:tcMar>
+          </w:tcPr>
+          <w:p>
+            <w:pPr>
+              <w:spacing w:after="40" w:line="260"/>
+            </w:pPr>
+            <w:r>
+              <w:rPr>
+                <w:sz w:val="19"/>
+                <w:szCs w:val="19"/>
+              </w:rPr>
+              <w:t xml:space="preserve">none; must be set</w:t>
+            </w:r>
+          </w:p>
+        </w:tc>
+        <w:tc>
+          <w:tcPr>
+            <w:tcW w:type="dxa" w:w="3126"/>
+            <w:tcBorders>
+              <w:top w:val="single" w:color="C9D1DC" w:sz="4"/>
+              <w:left w:val="single" w:color="C9D1DC" w:sz="4"/>
+              <w:bottom w:val="single" w:color="C9D1DC" w:sz="4"/>
+              <w:right w:val="single" w:color="C9D1DC" w:sz="4"/>
+            </w:tcBorders>
+            <w:tcMar>
+              <w:top w:type="dxa" w:w="70"/>
+              <w:left w:type="dxa" w:w="100"/>
+              <w:bottom w:type="dxa" w:w="70"/>
+              <w:right w:type="dxa" w:w="100"/>
+            </w:tcMar>
+          </w:tcPr>
+          <w:p>
+            <w:pPr>
+              <w:spacing w:after="40" w:line="260"/>
+            </w:pPr>
+            <w:r>
+              <w:rPr>
+                <w:sz w:val="19"/>
+                <w:szCs w:val="19"/>
+              </w:rPr>
+              <w:t xml:space="preserve">Ledger, registry and seed script: the shared secret for appending a root</w:t>
+            </w:r>
+          </w:p>
+        </w:tc>
+      </w:tr>
+      <w:tr>
+        <w:trPr>
+          <w:cantSplit/>
+        </w:trPr>
+        <w:tc>
+          <w:tcPr>
+            <w:tcW w:type="dxa" w:w="3300"/>
+            <w:tcBorders>
+              <w:top w:val="single" w:color="C9D1DC" w:sz="4"/>
+              <w:left w:val="single" w:color="C9D1DC" w:sz="4"/>
+              <w:bottom w:val="single" w:color="C9D1DC" w:sz="4"/>
+              <w:right w:val="single" w:color="C9D1DC" w:sz="4"/>
+            </w:tcBorders>
+            <w:tcMar>
+              <w:top w:type="dxa" w:w="70"/>
+              <w:left w:type="dxa" w:w="100"/>
+              <w:bottom w:type="dxa" w:w="70"/>
+              <w:right w:type="dxa" w:w="100"/>
+            </w:tcMar>
+          </w:tcPr>
+          <w:p>
+            <w:pPr>
+              <w:spacing w:after="40" w:line="260"/>
+            </w:pPr>
+            <w:r>
+              <w:rPr>
+                <w:rFonts w:ascii="Consolas" w:cs="Consolas" w:eastAsia="Consolas" w:hAnsi="Consolas"/>
+                <w:sz w:val="17"/>
+                <w:szCs w:val="17"/>
+              </w:rPr>
+              <w:t xml:space="preserve">PROOFCHAIN_SESSION_SECRET</w:t>
+            </w:r>
+          </w:p>
+        </w:tc>
+        <w:tc>
+          <w:tcPr>
+            <w:tcW w:type="dxa" w:w="2600"/>
+            <w:tcBorders>
+              <w:top w:val="single" w:color="C9D1DC" w:sz="4"/>
+              <w:left w:val="single" w:color="C9D1DC" w:sz="4"/>
+              <w:bottom w:val="single" w:color="C9D1DC" w:sz="4"/>
+              <w:right w:val="single" w:color="C9D1DC" w:sz="4"/>
+            </w:tcBorders>
+            <w:tcMar>
+              <w:top w:type="dxa" w:w="70"/>
+              <w:left w:type="dxa" w:w="100"/>
+              <w:bottom w:type="dxa" w:w="70"/>
+              <w:right w:type="dxa" w:w="100"/>
+            </w:tcMar>
+          </w:tcPr>
+          <w:p>
+            <w:pPr>
+              <w:spacing w:after="40" w:line="260"/>
+            </w:pPr>
+            <w:r>
+              <w:rPr>
+                <w:sz w:val="19"/>
+                <w:szCs w:val="19"/>
+              </w:rPr>
+              <w:t xml:space="preserve">generated into </w:t>
+            </w:r>
+            <w:r>
+              <w:rPr>
+                <w:rFonts w:ascii="Consolas" w:cs="Consolas" w:eastAsia="Consolas" w:hAnsi="Consolas"/>
+                <w:sz w:val="17"/>
+                <w:szCs w:val="17"/>
+              </w:rPr>
+              <w:t xml:space="preserve">data/session_secret</w:t>
+            </w:r>
+          </w:p>
+        </w:tc>
+        <w:tc>
+          <w:tcPr>
+            <w:tcW w:type="dxa" w:w="3126"/>
+            <w:tcBorders>
+              <w:top w:val="single" w:color="C9D1DC" w:sz="4"/>
+              <w:left w:val="single" w:color="C9D1DC" w:sz="4"/>
+              <w:bottom w:val="single" w:color="C9D1DC" w:sz="4"/>
+              <w:right w:val="single" w:color="C9D1DC" w:sz="4"/>
+            </w:tcBorders>
+            <w:tcMar>
+              <w:top w:type="dxa" w:w="70"/>
+              <w:left w:type="dxa" w:w="100"/>
+              <w:bottom w:type="dxa" w:w="70"/>
+              <w:right w:type="dxa" w:w="100"/>
+            </w:tcMar>
+          </w:tcPr>
+          <w:p>
+            <w:pPr>
+              <w:spacing w:after="40" w:line="260"/>
+            </w:pPr>
+            <w:r>
+              <w:rPr>
+                <w:sz w:val="19"/>
+                <w:szCs w:val="19"/>
+              </w:rPr>
+              <w:t xml:space="preserve">Registry: signs the session cookies</w:t>
             </w:r>
           </w:p>
         </w:tc>
@@ -9896,7 +10433,7 @@
                 <w:sz w:val="19"/>
                 <w:szCs w:val="19"/>
               </w:rPr>
-              <w:t xml:space="preserve">Documents, fingerprints, metadata, batch membership</w:t>
+              <w:t xml:space="preserve">Documents, fingerprints, metadata, batch membership and ownership, staff accounts</w:t>
             </w:r>
           </w:p>
         </w:tc>
@@ -9925,7 +10462,7 @@
                 <w:sz w:val="19"/>
                 <w:szCs w:val="19"/>
               </w:rPr>
-              <w:t xml:space="preserve">Accept uploads, build trees, request publication, issue proofs, audit itself</w:t>
+              <w:t xml:space="preserve">Sign staff in, accept uploads, build trees, request publication, issue proofs, audit itself</w:t>
             </w:r>
           </w:p>
         </w:tc>
@@ -10046,7 +10583,7 @@
                 <w:sz w:val="19"/>
                 <w:szCs w:val="19"/>
               </w:rPr>
-              <w:t xml:space="preserve">Append a signed entry, serve entries and its public key, refuse to start if its own file fails the chain check</w:t>
+              <w:t xml:space="preserve">Append a signed entry for a caller that presents the token, serve entries and its public key to anyone, refuse to start if its own file fails the chain check</w:t>
             </w:r>
           </w:p>
         </w:tc>
@@ -10355,6 +10892,14 @@
       </w:r>
       <w:r>
         <w:t xml:space="preserve">The verifier and core packages import nothing from the registry or AI packages. An automated test enforces this, so the independence claim is checked on every test run, not just promised.</w:t>
+      </w:r>
+    </w:p>
+    <w:p>
+      <w:pPr>
+        <w:spacing w:after="140" w:line="288"/>
+      </w:pPr>
+      <w:r>
+        <w:t xml:space="preserve">Staff sign in to the registry with a username and password, and a signed session cookie carries the account from page to page. Each custodian has their own open batch and seals it themselves; an admin may seal any open batch. The ledger accepts a new root only from a caller that presents a shared token. None of this reaches the verifier: the Verify page, every read of the ledger, the command-line verifier and the browser verifier need no account and no token. Who owns a batch and who sealed it are kept in the registry's database only, never in a proof or a ledger entry.</w:t>
       </w:r>
     </w:p>
     <w:p>
@@ -10455,7 +11000,7 @@
         <w:spacing w:after="70" w:line="280"/>
       </w:pPr>
       <w:r>
-        <w:t xml:space="preserve">A staff member uploads a file, or fills in a structured record.</w:t>
+        <w:t xml:space="preserve">A signed-in staff member uploads a file, or fills in a structured record.</w:t>
       </w:r>
     </w:p>
     <w:p>
@@ -10503,7 +11048,7 @@
         <w:spacing w:after="70" w:line="280"/>
       </w:pPr>
       <w:r>
-        <w:t xml:space="preserve">It computes the SHA-256 fingerprint and shows it on screen.</w:t>
+        <w:t xml:space="preserve">It computes the SHA-256 fingerprint and shows it on screen, and gives the record a random salt. If the same content is already registered, it says so and names the earlier record, but still stores the upload.</w:t>
       </w:r>
     </w:p>
     <w:p>
@@ -10529,7 +11074,7 @@
         <w:spacing w:after="70" w:line="280"/>
       </w:pPr>
       <w:r>
-        <w:t xml:space="preserve">The staff member checks, corrects and confirms the metadata. Until then the record cannot enter a batch.</w:t>
+        <w:t xml:space="preserve">The staff member checks, corrects and confirms the metadata. The confirmation is recorded under the account they are signed in with. Until then the record cannot enter a batch.</w:t>
       </w:r>
     </w:p>
     <w:p>
@@ -10542,7 +11087,7 @@
         <w:spacing w:after="70" w:line="280"/>
       </w:pPr>
       <w:r>
-        <w:t xml:space="preserve">The confirmed record joins the currently open batch at the next leaf position.</w:t>
+        <w:t xml:space="preserve">The confirmed record joins that staff member's own open batch at the next leaf position. Each custodian has one open batch, and the first confirmation after a seal opens a new one.</w:t>
       </w:r>
     </w:p>
     <w:p>
@@ -10563,7 +11108,7 @@
         <w:spacing w:after="70" w:line="280"/>
       </w:pPr>
       <w:r>
-        <w:t xml:space="preserve">A staff member closes the batch with the Seal button. No more records can join it.</w:t>
+        <w:t xml:space="preserve">The batch's owner, or an admin, closes the batch with the Seal button. No more records can join it.</w:t>
       </w:r>
     </w:p>
     <w:p>
@@ -10576,7 +11121,7 @@
         <w:spacing w:after="70" w:line="280"/>
       </w:pPr>
       <w:r>
-        <w:t xml:space="preserve">The registry builds the Merkle tree over the fingerprints in leaf order and obtains the root.</w:t>
+        <w:t xml:space="preserve">The registry builds the Merkle tree over the salted fingerprints in leaf order and obtains the root.</w:t>
       </w:r>
     </w:p>
     <w:p>
@@ -10589,7 +11134,7 @@
         <w:spacing w:after="70" w:line="280"/>
       </w:pPr>
       <w:r>
-        <w:t xml:space="preserve">It sends the batch id, root and tree size to the ledger service.</w:t>
+        <w:t xml:space="preserve">It sends the batch id, root and tree size to the ledger service, with the ledger token.</w:t>
       </w:r>
     </w:p>
     <w:p>
@@ -10636,7 +11181,7 @@
         <w:spacing w:after="140" w:line="288"/>
       </w:pPr>
       <w:r>
-        <w:t xml:space="preserve">The root is sent to the ledger before the batch is marked sealed. If the registry stops between the two steps, sealing again adopts the entry that is already there when it carries the same root, and refuses when it carries a different one: a published root cannot be replaced. At its first seal the registry records the ledger's public key, and with every seal the entry hash it was given. Together these are the registry's own checkpoint.</w:t>
+        <w:t xml:space="preserve">The root is sent to the ledger before the batch is marked sealed. If the registry stops between the two steps, sealing again adopts the entry that is already there when it carries the same root, and refuses when it carries a different one: a published root cannot be replaced. At its first seal the registry records the ledger's public key, and with every seal the entry hash it was given. Together these are the registry's own checkpoint. The batch also records who sealed it. Batch ids are numbered in order of creation and name nobody.</w:t>
       </w:r>
     </w:p>
     <w:p>
@@ -10817,7 +11362,7 @@
         <w:spacing w:after="70" w:line="280"/>
       </w:pPr>
       <w:r>
-        <w:t xml:space="preserve">For each sealed batch, rebuild the Merkle root from the stored fingerprints.</w:t>
+        <w:t xml:space="preserve">For each sealed batch, rebuild the Merkle root from the stored fingerprints and salts.</w:t>
       </w:r>
     </w:p>
     <w:p>
@@ -11967,6 +12512,23 @@
           <w:sz w:val="17"/>
           <w:szCs w:val="17"/>
         </w:rPr>
+        <w:t xml:space="preserve">               staff.py  sessions.py              accounts and session cookies</w:t>
+      </w:r>
+    </w:p>
+    <w:p>
+      <w:pPr>
+        <w:keepNext/>
+        <w:keepLines/>
+        <w:shd w:fill="F3F5F8" w:val="clear"/>
+        <w:spacing w:after="0" w:before="0" w:line="250"/>
+        <w:ind w:left="120" w:right="120"/>
+      </w:pPr>
+      <w:r>
+        <w:rPr>
+          <w:rFonts w:ascii="Consolas" w:cs="Consolas" w:eastAsia="Consolas" w:hAnsi="Consolas"/>
+          <w:sz w:val="17"/>
+          <w:szCs w:val="17"/>
+        </w:rPr>
         <w:t xml:space="preserve">               templates/  static/                FastAPI on port 8000, SQLite</w:t>
       </w:r>
     </w:p>
@@ -12018,7 +12580,7 @@
           <w:sz w:val="17"/>
           <w:szCs w:val="17"/>
         </w:rPr>
-        <w:t xml:space="preserve">tests/         test_*.py  conftest.py  helpers.py  web_verifier_runner.mjs  vectors/examples.json</w:t>
+        <w:t xml:space="preserve">tests/         test_*.py  conftest.py  helpers.py  web_verifier_runner.mjs</w:t>
       </w:r>
     </w:p>
     <w:p>
@@ -12035,7 +12597,24 @@
           <w:sz w:val="17"/>
           <w:szCs w:val="17"/>
         </w:rPr>
-        <w:t xml:space="preserve">data/          registry.db  ledger.jsonl  ledger_key.pem   created at run time, not in Git</w:t>
+        <w:t xml:space="preserve">               vectors/examples.json</w:t>
+      </w:r>
+    </w:p>
+    <w:p>
+      <w:pPr>
+        <w:keepNext/>
+        <w:keepLines/>
+        <w:shd w:fill="F3F5F8" w:val="clear"/>
+        <w:spacing w:after="0" w:before="0" w:line="250"/>
+        <w:ind w:left="120" w:right="120"/>
+      </w:pPr>
+      <w:r>
+        <w:rPr>
+          <w:rFonts w:ascii="Consolas" w:cs="Consolas" w:eastAsia="Consolas" w:hAnsi="Consolas"/>
+          <w:sz w:val="17"/>
+          <w:szCs w:val="17"/>
+        </w:rPr>
+        <w:t xml:space="preserve">data/          registry.db  ledger.jsonl  ledger_key.pem  session_secret    not in Git</w:t>
       </w:r>
     </w:p>
     <w:p>
@@ -12107,6 +12686,14 @@
     </w:p>
     <w:p>
       <w:pPr>
+        <w:spacing w:after="140" w:line="288"/>
+      </w:pPr>
+      <w:r>
+        <w:t xml:space="preserve">There are two versions, and both verify. Version 1 is unsalted and is the form used in the worked example of Section 3.4:</w:t>
+      </w:r>
+    </w:p>
+    <w:p>
+      <w:pPr>
         <w:keepNext/>
         <w:keepLines/>
         <w:shd w:fill="F3F5F8" w:val="clear"/>
@@ -12358,6 +12945,305 @@
           <w:szCs w:val="17"/>
         </w:rPr>
         <w:t xml:space="preserve">}</w:t>
+      </w:r>
+    </w:p>
+    <w:p>
+      <w:pPr>
+        <w:spacing w:after="140" w:line="288"/>
+      </w:pPr>
+      <w:r>
+        <w:t xml:space="preserve">Version 2 is what the registry issues. It adds the record's own salt, and the path and root are those of the salted tree. Below is the same Document C, in the same position, with salts:</w:t>
+      </w:r>
+    </w:p>
+    <w:p>
+      <w:pPr>
+        <w:keepNext/>
+        <w:keepLines/>
+        <w:shd w:fill="F3F5F8" w:val="clear"/>
+        <w:spacing w:after="0" w:before="60" w:line="250"/>
+        <w:ind w:left="120" w:right="120"/>
+      </w:pPr>
+      <w:r>
+        <w:rPr>
+          <w:rFonts w:ascii="Consolas" w:cs="Consolas" w:eastAsia="Consolas" w:hAnsi="Consolas"/>
+          <w:sz w:val="17"/>
+          <w:szCs w:val="17"/>
+        </w:rPr>
+        <w:t xml:space="preserve">{</w:t>
+      </w:r>
+    </w:p>
+    <w:p>
+      <w:pPr>
+        <w:keepNext/>
+        <w:keepLines/>
+        <w:shd w:fill="F3F5F8" w:val="clear"/>
+        <w:spacing w:after="0" w:before="0" w:line="250"/>
+        <w:ind w:left="120" w:right="120"/>
+      </w:pPr>
+      <w:r>
+        <w:rPr>
+          <w:rFonts w:ascii="Consolas" w:cs="Consolas" w:eastAsia="Consolas" w:hAnsi="Consolas"/>
+          <w:sz w:val="17"/>
+          <w:szCs w:val="17"/>
+        </w:rPr>
+        <w:t xml:space="preserve">  "version": 2,</w:t>
+      </w:r>
+    </w:p>
+    <w:p>
+      <w:pPr>
+        <w:keepNext/>
+        <w:keepLines/>
+        <w:shd w:fill="F3F5F8" w:val="clear"/>
+        <w:spacing w:after="0" w:before="0" w:line="250"/>
+        <w:ind w:left="120" w:right="120"/>
+      </w:pPr>
+      <w:r>
+        <w:rPr>
+          <w:rFonts w:ascii="Consolas" w:cs="Consolas" w:eastAsia="Consolas" w:hAnsi="Consolas"/>
+          <w:sz w:val="17"/>
+          <w:szCs w:val="17"/>
+        </w:rPr>
+        <w:t xml:space="preserve">  "canon": "raw-bytes-v1",</w:t>
+      </w:r>
+    </w:p>
+    <w:p>
+      <w:pPr>
+        <w:keepNext/>
+        <w:keepLines/>
+        <w:shd w:fill="F3F5F8" w:val="clear"/>
+        <w:spacing w:after="0" w:before="0" w:line="250"/>
+        <w:ind w:left="120" w:right="120"/>
+      </w:pPr>
+      <w:r>
+        <w:rPr>
+          <w:rFonts w:ascii="Consolas" w:cs="Consolas" w:eastAsia="Consolas" w:hAnsi="Consolas"/>
+          <w:sz w:val="17"/>
+          <w:szCs w:val="17"/>
+        </w:rPr>
+        <w:t xml:space="preserve">  "fingerprint": "90eafcf01a14b00bf7d8e2ab6abd10b1e6944ad0fc3d7ac1dfeacff8976ba4aa",</w:t>
+      </w:r>
+    </w:p>
+    <w:p>
+      <w:pPr>
+        <w:keepNext/>
+        <w:keepLines/>
+        <w:shd w:fill="F3F5F8" w:val="clear"/>
+        <w:spacing w:after="0" w:before="0" w:line="250"/>
+        <w:ind w:left="120" w:right="120"/>
+      </w:pPr>
+      <w:r>
+        <w:rPr>
+          <w:rFonts w:ascii="Consolas" w:cs="Consolas" w:eastAsia="Consolas" w:hAnsi="Consolas"/>
+          <w:sz w:val="17"/>
+          <w:szCs w:val="17"/>
+        </w:rPr>
+        <w:t xml:space="preserve">  "salt": "5ef89eab6ed3ff1d4f8a65a207418cb47a2c7fab138a6e75c12e91dbf2cefe92",</w:t>
+      </w:r>
+    </w:p>
+    <w:p>
+      <w:pPr>
+        <w:keepNext/>
+        <w:keepLines/>
+        <w:shd w:fill="F3F5F8" w:val="clear"/>
+        <w:spacing w:after="0" w:before="0" w:line="250"/>
+        <w:ind w:left="120" w:right="120"/>
+      </w:pPr>
+      <w:r>
+        <w:rPr>
+          <w:rFonts w:ascii="Consolas" w:cs="Consolas" w:eastAsia="Consolas" w:hAnsi="Consolas"/>
+          <w:sz w:val="17"/>
+          <w:szCs w:val="17"/>
+        </w:rPr>
+        <w:t xml:space="preserve">  "batch_id": "batch-0001",</w:t>
+      </w:r>
+    </w:p>
+    <w:p>
+      <w:pPr>
+        <w:keepNext/>
+        <w:keepLines/>
+        <w:shd w:fill="F3F5F8" w:val="clear"/>
+        <w:spacing w:after="0" w:before="0" w:line="250"/>
+        <w:ind w:left="120" w:right="120"/>
+      </w:pPr>
+      <w:r>
+        <w:rPr>
+          <w:rFonts w:ascii="Consolas" w:cs="Consolas" w:eastAsia="Consolas" w:hAnsi="Consolas"/>
+          <w:sz w:val="17"/>
+          <w:szCs w:val="17"/>
+        </w:rPr>
+        <w:t xml:space="preserve">  "leaf_index": 2,</w:t>
+      </w:r>
+    </w:p>
+    <w:p>
+      <w:pPr>
+        <w:keepNext/>
+        <w:keepLines/>
+        <w:shd w:fill="F3F5F8" w:val="clear"/>
+        <w:spacing w:after="0" w:before="0" w:line="250"/>
+        <w:ind w:left="120" w:right="120"/>
+      </w:pPr>
+      <w:r>
+        <w:rPr>
+          <w:rFonts w:ascii="Consolas" w:cs="Consolas" w:eastAsia="Consolas" w:hAnsi="Consolas"/>
+          <w:sz w:val="17"/>
+          <w:szCs w:val="17"/>
+        </w:rPr>
+        <w:t xml:space="preserve">  "tree_size": 4,</w:t>
+      </w:r>
+    </w:p>
+    <w:p>
+      <w:pPr>
+        <w:keepNext/>
+        <w:keepLines/>
+        <w:shd w:fill="F3F5F8" w:val="clear"/>
+        <w:spacing w:after="0" w:before="0" w:line="250"/>
+        <w:ind w:left="120" w:right="120"/>
+      </w:pPr>
+      <w:r>
+        <w:rPr>
+          <w:rFonts w:ascii="Consolas" w:cs="Consolas" w:eastAsia="Consolas" w:hAnsi="Consolas"/>
+          <w:sz w:val="17"/>
+          <w:szCs w:val="17"/>
+        </w:rPr>
+        <w:t xml:space="preserve">  "path": [</w:t>
+      </w:r>
+    </w:p>
+    <w:p>
+      <w:pPr>
+        <w:keepNext/>
+        <w:keepLines/>
+        <w:shd w:fill="F3F5F8" w:val="clear"/>
+        <w:spacing w:after="0" w:before="0" w:line="250"/>
+        <w:ind w:left="120" w:right="120"/>
+      </w:pPr>
+      <w:r>
+        <w:rPr>
+          <w:rFonts w:ascii="Consolas" w:cs="Consolas" w:eastAsia="Consolas" w:hAnsi="Consolas"/>
+          <w:sz w:val="17"/>
+          <w:szCs w:val="17"/>
+        </w:rPr>
+        <w:t xml:space="preserve">    {"side": "right",</w:t>
+      </w:r>
+    </w:p>
+    <w:p>
+      <w:pPr>
+        <w:keepNext/>
+        <w:keepLines/>
+        <w:shd w:fill="F3F5F8" w:val="clear"/>
+        <w:spacing w:after="0" w:before="0" w:line="250"/>
+        <w:ind w:left="120" w:right="120"/>
+      </w:pPr>
+      <w:r>
+        <w:rPr>
+          <w:rFonts w:ascii="Consolas" w:cs="Consolas" w:eastAsia="Consolas" w:hAnsi="Consolas"/>
+          <w:sz w:val="17"/>
+          <w:szCs w:val="17"/>
+        </w:rPr>
+        <w:t xml:space="preserve">     "hash": "6a004d3ae16e160694d06f03100c10c734af722f49ff7a85afb0e35be4472354"},</w:t>
+      </w:r>
+    </w:p>
+    <w:p>
+      <w:pPr>
+        <w:keepNext/>
+        <w:keepLines/>
+        <w:shd w:fill="F3F5F8" w:val="clear"/>
+        <w:spacing w:after="0" w:before="0" w:line="250"/>
+        <w:ind w:left="120" w:right="120"/>
+      </w:pPr>
+      <w:r>
+        <w:rPr>
+          <w:rFonts w:ascii="Consolas" w:cs="Consolas" w:eastAsia="Consolas" w:hAnsi="Consolas"/>
+          <w:sz w:val="17"/>
+          <w:szCs w:val="17"/>
+        </w:rPr>
+        <w:t xml:space="preserve">    {"side": "left",</w:t>
+      </w:r>
+    </w:p>
+    <w:p>
+      <w:pPr>
+        <w:keepNext/>
+        <w:keepLines/>
+        <w:shd w:fill="F3F5F8" w:val="clear"/>
+        <w:spacing w:after="0" w:before="0" w:line="250"/>
+        <w:ind w:left="120" w:right="120"/>
+      </w:pPr>
+      <w:r>
+        <w:rPr>
+          <w:rFonts w:ascii="Consolas" w:cs="Consolas" w:eastAsia="Consolas" w:hAnsi="Consolas"/>
+          <w:sz w:val="17"/>
+          <w:szCs w:val="17"/>
+        </w:rPr>
+        <w:t xml:space="preserve">     "hash": "aed11db21d0722ca46af87e5275cd8e28d7345202d632cac1601efa43dbec96d"}</w:t>
+      </w:r>
+    </w:p>
+    <w:p>
+      <w:pPr>
+        <w:keepNext/>
+        <w:keepLines/>
+        <w:shd w:fill="F3F5F8" w:val="clear"/>
+        <w:spacing w:after="0" w:before="0" w:line="250"/>
+        <w:ind w:left="120" w:right="120"/>
+      </w:pPr>
+      <w:r>
+        <w:rPr>
+          <w:rFonts w:ascii="Consolas" w:cs="Consolas" w:eastAsia="Consolas" w:hAnsi="Consolas"/>
+          <w:sz w:val="17"/>
+          <w:szCs w:val="17"/>
+        </w:rPr>
+        <w:t xml:space="preserve">  ],</w:t>
+      </w:r>
+    </w:p>
+    <w:p>
+      <w:pPr>
+        <w:keepNext/>
+        <w:keepLines/>
+        <w:shd w:fill="F3F5F8" w:val="clear"/>
+        <w:spacing w:after="0" w:before="0" w:line="250"/>
+        <w:ind w:left="120" w:right="120"/>
+      </w:pPr>
+      <w:r>
+        <w:rPr>
+          <w:rFonts w:ascii="Consolas" w:cs="Consolas" w:eastAsia="Consolas" w:hAnsi="Consolas"/>
+          <w:sz w:val="17"/>
+          <w:szCs w:val="17"/>
+        </w:rPr>
+        <w:t xml:space="preserve">  "root": "903f08390e93da3222e78f2b66e3d7eea6339456da49759ea30fec7447ff2038"</w:t>
+      </w:r>
+    </w:p>
+    <w:p>
+      <w:pPr>
+        <w:keepNext w:val="false"/>
+        <w:keepLines/>
+        <w:shd w:fill="F3F5F8" w:val="clear"/>
+        <w:spacing w:after="180" w:before="0" w:line="250"/>
+        <w:ind w:left="120" w:right="120"/>
+      </w:pPr>
+      <w:r>
+        <w:rPr>
+          <w:rFonts w:ascii="Consolas" w:cs="Consolas" w:eastAsia="Consolas" w:hAnsi="Consolas"/>
+          <w:sz w:val="17"/>
+          <w:szCs w:val="17"/>
+        </w:rPr>
+        <w:t xml:space="preserve">}</w:t>
+      </w:r>
+    </w:p>
+    <w:p>
+      <w:pPr>
+        <w:spacing w:after="140" w:line="288"/>
+      </w:pPr>
+      <w:r>
+        <w:t xml:space="preserve">The verifier computes the leaf value from the bundle's fingerprint and salt, then folds the path as before. A wrong salt, or a salted proof with its salt removed and its version set back to 1, gives </w:t>
+      </w:r>
+      <w:r>
+        <w:rPr>
+          <w:rFonts w:ascii="Consolas" w:cs="Consolas" w:eastAsia="Consolas" w:hAnsi="Consolas"/>
+          <w:sz w:val="20"/>
+          <w:szCs w:val="20"/>
+        </w:rPr>
+        <w:t xml:space="preserve">PROOF_INVALID</w:t>
+      </w:r>
+      <w:r>
+        <w:t xml:space="preserve">. A version 1 bundle that carries a salt, a version 2 bundle without one, and any other version are malformed. The bundle holds no other record's salt or fingerprint.</w:t>
       </w:r>
     </w:p>
     <w:p>
@@ -12919,7 +13805,7 @@
                 <w:sz w:val="19"/>
                 <w:szCs w:val="19"/>
               </w:rPr>
-              <w:t xml:space="preserve">id, filename, content (blob), canon, fingerprint, suggested_metadata (JSON), metadata (JSON), metadata_confirmed, confirmed_by, batch_id, leaf_index, created_at</w:t>
+              <w:t xml:space="preserve">id, filename, content (blob), canon, fingerprint, salt, suggested_metadata (JSON), metadata (JSON), metadata_confirmed, confirmed_by, batch_id, leaf_index, created_at</w:t>
             </w:r>
           </w:p>
         </w:tc>
@@ -12983,7 +13869,7 @@
                 <w:sz w:val="19"/>
                 <w:szCs w:val="19"/>
               </w:rPr>
-              <w:t xml:space="preserve">id, status (open or sealed), root, tree_size, ledger_seq, ledger_entry_hash, sealed_at</w:t>
+              <w:t xml:space="preserve">id, status (open or sealed), root, tree_size, ledger_seq, ledger_entry_hash, sealed_at, owner, sealed_by. One open batch per owner.</w:t>
             </w:r>
           </w:p>
         </w:tc>
@@ -13048,6 +13934,70 @@
                 <w:szCs w:val="19"/>
               </w:rPr>
               <w:t xml:space="preserve">key, value. Holds the ledger public key recorded at the first seal.</w:t>
+            </w:r>
+          </w:p>
+        </w:tc>
+      </w:tr>
+      <w:tr>
+        <w:trPr>
+          <w:cantSplit/>
+        </w:trPr>
+        <w:tc>
+          <w:tcPr>
+            <w:tcW w:type="dxa" w:w="1500"/>
+            <w:tcBorders>
+              <w:top w:val="single" w:color="C9D1DC" w:sz="4"/>
+              <w:left w:val="single" w:color="C9D1DC" w:sz="4"/>
+              <w:bottom w:val="single" w:color="C9D1DC" w:sz="4"/>
+              <w:right w:val="single" w:color="C9D1DC" w:sz="4"/>
+            </w:tcBorders>
+            <w:tcMar>
+              <w:top w:type="dxa" w:w="70"/>
+              <w:left w:type="dxa" w:w="100"/>
+              <w:bottom w:type="dxa" w:w="70"/>
+              <w:right w:type="dxa" w:w="100"/>
+            </w:tcMar>
+          </w:tcPr>
+          <w:p>
+            <w:pPr>
+              <w:spacing w:after="40" w:line="260"/>
+            </w:pPr>
+            <w:r>
+              <w:rPr>
+                <w:rFonts w:ascii="Consolas" w:cs="Consolas" w:eastAsia="Consolas" w:hAnsi="Consolas"/>
+                <w:sz w:val="17"/>
+                <w:szCs w:val="17"/>
+              </w:rPr>
+              <w:t xml:space="preserve">staff</w:t>
+            </w:r>
+          </w:p>
+        </w:tc>
+        <w:tc>
+          <w:tcPr>
+            <w:tcW w:type="dxa" w:w="7526"/>
+            <w:tcBorders>
+              <w:top w:val="single" w:color="C9D1DC" w:sz="4"/>
+              <w:left w:val="single" w:color="C9D1DC" w:sz="4"/>
+              <w:bottom w:val="single" w:color="C9D1DC" w:sz="4"/>
+              <w:right w:val="single" w:color="C9D1DC" w:sz="4"/>
+            </w:tcBorders>
+            <w:tcMar>
+              <w:top w:type="dxa" w:w="70"/>
+              <w:left w:type="dxa" w:w="100"/>
+              <w:bottom w:type="dxa" w:w="70"/>
+              <w:right w:type="dxa" w:w="100"/>
+            </w:tcMar>
+          </w:tcPr>
+          <w:p>
+            <w:pPr>
+              <w:spacing w:after="40" w:line="260"/>
+            </w:pPr>
+            <w:r>
+              <w:rPr>
+                <w:sz w:val="19"/>
+                <w:szCs w:val="19"/>
+              </w:rPr>
+              <w:t xml:space="preserve">username, password_hash (salted scrypt; the password itself is never stored), created_at, is_admin</w:t>
             </w:r>
           </w:p>
         </w:tc>
@@ -14571,7 +15521,7 @@
                 <w:sz w:val="19"/>
                 <w:szCs w:val="19"/>
               </w:rPr>
-              <w:t xml:space="preserve">Append a root. The service adds prev_hash, entry_hash and signature. Returns 201 with the signed entry, 409 if the batch already has a root, 422 if the input is malformed.</w:t>
+              <w:t xml:space="preserve">Append a root. The service adds prev_hash, entry_hash and signature. Returns 201 with the signed entry, 409 if the batch already has a root, 422 if the input is malformed. Needs the ledger token as a bearer token: 401 without the right one, 503 if the ledger was started without one.</w:t>
             </w:r>
           </w:p>
         </w:tc>
@@ -14686,7 +15636,7 @@
                 <w:sz w:val="19"/>
                 <w:szCs w:val="19"/>
               </w:rPr>
-              <w:t xml:space="preserve">Read the whole chain as a list, or one entry (404 if the batch is not published)</w:t>
+              <w:t xml:space="preserve">Read the whole chain as a list, or one entry (404 if the batch is not published). No credential needed.</w:t>
             </w:r>
           </w:p>
         </w:tc>
@@ -14858,7 +15808,37 @@
                 <w:sz w:val="17"/>
                 <w:szCs w:val="17"/>
               </w:rPr>
-              <w:t xml:space="preserve">POST /records</w:t>
+              <w:t xml:space="preserve">GET /login</w:t>
+            </w:r>
+            <w:r>
+              <w:rPr>
+                <w:sz w:val="19"/>
+                <w:szCs w:val="19"/>
+              </w:rPr>
+              <w:t xml:space="preserve">, </w:t>
+            </w:r>
+            <w:r>
+              <w:rPr>
+                <w:rFonts w:ascii="Consolas" w:cs="Consolas" w:eastAsia="Consolas" w:hAnsi="Consolas"/>
+                <w:sz w:val="17"/>
+                <w:szCs w:val="17"/>
+              </w:rPr>
+              <w:t xml:space="preserve">POST /login</w:t>
+            </w:r>
+            <w:r>
+              <w:rPr>
+                <w:sz w:val="19"/>
+                <w:szCs w:val="19"/>
+              </w:rPr>
+              <w:t xml:space="preserve">, </w:t>
+            </w:r>
+            <w:r>
+              <w:rPr>
+                <w:rFonts w:ascii="Consolas" w:cs="Consolas" w:eastAsia="Consolas" w:hAnsi="Consolas"/>
+                <w:sz w:val="17"/>
+                <w:szCs w:val="17"/>
+              </w:rPr>
+              <w:t xml:space="preserve">POST /logout</w:t>
             </w:r>
           </w:p>
         </w:tc>
@@ -14887,7 +15867,7 @@
                 <w:sz w:val="19"/>
                 <w:szCs w:val="19"/>
               </w:rPr>
-              <w:t xml:space="preserve">Upload and fingerprint; ask the AI helper for suggestions. Refuses an empty file (422), a file over 10 MB (413) and content that does not fit the chosen canonical form (422).</w:t>
+              <w:t xml:space="preserve">Sign in with a username and password, and sign out. Signing in sets a signed, HttpOnly, SameSite=Lax session cookie. 401 for a wrong username or password, with one message for both.</w:t>
             </w:r>
           </w:p>
         </w:tc>
@@ -14951,7 +15931,7 @@
                 <w:sz w:val="17"/>
                 <w:szCs w:val="17"/>
               </w:rPr>
-              <w:t xml:space="preserve">POST /records/{id}/confirm</w:t>
+              <w:t xml:space="preserve">POST /records</w:t>
             </w:r>
           </w:p>
         </w:tc>
@@ -14980,7 +15960,7 @@
                 <w:sz w:val="19"/>
                 <w:szCs w:val="19"/>
               </w:rPr>
-              <w:t xml:space="preserve">A named person confirms the metadata; the record joins the open batch. 409 if it was already confirmed.</w:t>
+              <w:t xml:space="preserve">Upload and fingerprint; ask the AI helper for suggestions. Warns, but does not refuse, when the same content is already registered. Refuses an empty file (422), a file over 10 MB (413) and content that does not fit the chosen canonical form (422).</w:t>
             </w:r>
           </w:p>
         </w:tc>
@@ -15044,7 +16024,7 @@
                 <w:sz w:val="17"/>
                 <w:szCs w:val="17"/>
               </w:rPr>
-              <w:t xml:space="preserve">POST /batches/{id}/seal</w:t>
+              <w:t xml:space="preserve">POST /records/{id}/confirm</w:t>
             </w:r>
           </w:p>
         </w:tc>
@@ -15073,7 +16053,7 @@
                 <w:sz w:val="19"/>
                 <w:szCs w:val="19"/>
               </w:rPr>
-              <w:t xml:space="preserve">Build the tree and publish the root. 502 if the ledger cannot be reached (the batch stays open); 409 if the ledger holds a different root.</w:t>
+              <w:t xml:space="preserve">The signed-in account confirms the metadata; the record joins that account's own open batch. A name posted with the form is ignored. 409 if it was already confirmed.</w:t>
             </w:r>
           </w:p>
         </w:tc>
@@ -15137,7 +16117,7 @@
                 <w:sz w:val="17"/>
                 <w:szCs w:val="17"/>
               </w:rPr>
-              <w:t xml:space="preserve">GET /records/{id}/proof</w:t>
+              <w:t xml:space="preserve">POST /records/{id}/discard</w:t>
             </w:r>
           </w:p>
         </w:tc>
@@ -15166,7 +16146,7 @@
                 <w:sz w:val="19"/>
                 <w:szCs w:val="19"/>
               </w:rPr>
-              <w:t xml:space="preserve">Download the proof bundle. 409 until the batch is sealed.</w:t>
+              <w:t xml:space="preserve">Remove an upload that was never confirmed. 409 once it has been confirmed: a registered record cannot be removed.</w:t>
             </w:r>
           </w:p>
         </w:tc>
@@ -15230,7 +16210,7 @@
                 <w:sz w:val="17"/>
                 <w:szCs w:val="17"/>
               </w:rPr>
-              <w:t xml:space="preserve">GET /records/{id}/document</w:t>
+              <w:t xml:space="preserve">POST /batches/{id}/seal</w:t>
             </w:r>
           </w:p>
         </w:tc>
@@ -15259,7 +16239,7 @@
                 <w:sz w:val="19"/>
                 <w:szCs w:val="19"/>
               </w:rPr>
-              <w:t xml:space="preserve">Download the stored document</w:t>
+              <w:t xml:space="preserve">Build the tree and publish the root. 403 unless the caller owns the batch or is an admin. 502 if the ledger cannot be reached or refuses the token (the batch stays open); 409 if the ledger holds a different root.</w:t>
             </w:r>
           </w:p>
         </w:tc>
@@ -15323,7 +16303,7 @@
                 <w:sz w:val="17"/>
                 <w:szCs w:val="17"/>
               </w:rPr>
-              <w:t xml:space="preserve">POST /verify</w:t>
+              <w:t xml:space="preserve">GET /records/{id}/proof</w:t>
             </w:r>
           </w:p>
         </w:tc>
@@ -15352,7 +16332,7 @@
                 <w:sz w:val="19"/>
                 <w:szCs w:val="19"/>
               </w:rPr>
-              <w:t xml:space="preserve">Run the five checks on an uploaded document and proof. 502, with no verdict, if the ledger cannot be read.</w:t>
+              <w:t xml:space="preserve">Download the proof bundle. 409 until the batch is sealed.</w:t>
             </w:r>
           </w:p>
         </w:tc>
@@ -15416,6 +16396,192 @@
                 <w:sz w:val="17"/>
                 <w:szCs w:val="17"/>
               </w:rPr>
+              <w:t xml:space="preserve">GET /records/{id}/document</w:t>
+            </w:r>
+          </w:p>
+        </w:tc>
+        <w:tc>
+          <w:tcPr>
+            <w:tcW w:type="dxa" w:w="4726"/>
+            <w:tcBorders>
+              <w:top w:val="single" w:color="C9D1DC" w:sz="4"/>
+              <w:left w:val="single" w:color="C9D1DC" w:sz="4"/>
+              <w:bottom w:val="single" w:color="C9D1DC" w:sz="4"/>
+              <w:right w:val="single" w:color="C9D1DC" w:sz="4"/>
+            </w:tcBorders>
+            <w:tcMar>
+              <w:top w:type="dxa" w:w="70"/>
+              <w:left w:type="dxa" w:w="100"/>
+              <w:bottom w:type="dxa" w:w="70"/>
+              <w:right w:type="dxa" w:w="100"/>
+            </w:tcMar>
+          </w:tcPr>
+          <w:p>
+            <w:pPr>
+              <w:spacing w:after="40" w:line="260"/>
+            </w:pPr>
+            <w:r>
+              <w:rPr>
+                <w:sz w:val="19"/>
+                <w:szCs w:val="19"/>
+              </w:rPr>
+              <w:t xml:space="preserve">Download the stored document</w:t>
+            </w:r>
+          </w:p>
+        </w:tc>
+      </w:tr>
+      <w:tr>
+        <w:trPr>
+          <w:cantSplit/>
+        </w:trPr>
+        <w:tc>
+          <w:tcPr>
+            <w:tcW w:type="dxa" w:w="1300"/>
+            <w:tcBorders>
+              <w:top w:val="single" w:color="C9D1DC" w:sz="4"/>
+              <w:left w:val="single" w:color="C9D1DC" w:sz="4"/>
+              <w:bottom w:val="single" w:color="C9D1DC" w:sz="4"/>
+              <w:right w:val="single" w:color="C9D1DC" w:sz="4"/>
+            </w:tcBorders>
+            <w:tcMar>
+              <w:top w:type="dxa" w:w="70"/>
+              <w:left w:type="dxa" w:w="100"/>
+              <w:bottom w:type="dxa" w:w="70"/>
+              <w:right w:type="dxa" w:w="100"/>
+            </w:tcMar>
+          </w:tcPr>
+          <w:p>
+            <w:pPr>
+              <w:spacing w:after="40" w:line="260"/>
+            </w:pPr>
+            <w:r>
+              <w:rPr>
+                <w:sz w:val="19"/>
+                <w:szCs w:val="19"/>
+              </w:rPr>
+              <w:t xml:space="preserve">Registry</w:t>
+            </w:r>
+          </w:p>
+        </w:tc>
+        <w:tc>
+          <w:tcPr>
+            <w:tcW w:type="dxa" w:w="3000"/>
+            <w:tcBorders>
+              <w:top w:val="single" w:color="C9D1DC" w:sz="4"/>
+              <w:left w:val="single" w:color="C9D1DC" w:sz="4"/>
+              <w:bottom w:val="single" w:color="C9D1DC" w:sz="4"/>
+              <w:right w:val="single" w:color="C9D1DC" w:sz="4"/>
+            </w:tcBorders>
+            <w:tcMar>
+              <w:top w:type="dxa" w:w="70"/>
+              <w:left w:type="dxa" w:w="100"/>
+              <w:bottom w:type="dxa" w:w="70"/>
+              <w:right w:type="dxa" w:w="100"/>
+            </w:tcMar>
+          </w:tcPr>
+          <w:p>
+            <w:pPr>
+              <w:spacing w:after="40" w:line="260"/>
+            </w:pPr>
+            <w:r>
+              <w:rPr>
+                <w:rFonts w:ascii="Consolas" w:cs="Consolas" w:eastAsia="Consolas" w:hAnsi="Consolas"/>
+                <w:sz w:val="17"/>
+                <w:szCs w:val="17"/>
+              </w:rPr>
+              <w:t xml:space="preserve">POST /verify</w:t>
+            </w:r>
+          </w:p>
+        </w:tc>
+        <w:tc>
+          <w:tcPr>
+            <w:tcW w:type="dxa" w:w="4726"/>
+            <w:tcBorders>
+              <w:top w:val="single" w:color="C9D1DC" w:sz="4"/>
+              <w:left w:val="single" w:color="C9D1DC" w:sz="4"/>
+              <w:bottom w:val="single" w:color="C9D1DC" w:sz="4"/>
+              <w:right w:val="single" w:color="C9D1DC" w:sz="4"/>
+            </w:tcBorders>
+            <w:tcMar>
+              <w:top w:type="dxa" w:w="70"/>
+              <w:left w:type="dxa" w:w="100"/>
+              <w:bottom w:type="dxa" w:w="70"/>
+              <w:right w:type="dxa" w:w="100"/>
+            </w:tcMar>
+          </w:tcPr>
+          <w:p>
+            <w:pPr>
+              <w:spacing w:after="40" w:line="260"/>
+            </w:pPr>
+            <w:r>
+              <w:rPr>
+                <w:sz w:val="19"/>
+                <w:szCs w:val="19"/>
+              </w:rPr>
+              <w:t xml:space="preserve">Run the five checks on an uploaded document and proof. 502, with no verdict, if the ledger cannot be read. Public: no account needed.</w:t>
+            </w:r>
+          </w:p>
+        </w:tc>
+      </w:tr>
+      <w:tr>
+        <w:trPr>
+          <w:cantSplit/>
+        </w:trPr>
+        <w:tc>
+          <w:tcPr>
+            <w:tcW w:type="dxa" w:w="1300"/>
+            <w:tcBorders>
+              <w:top w:val="single" w:color="C9D1DC" w:sz="4"/>
+              <w:left w:val="single" w:color="C9D1DC" w:sz="4"/>
+              <w:bottom w:val="single" w:color="C9D1DC" w:sz="4"/>
+              <w:right w:val="single" w:color="C9D1DC" w:sz="4"/>
+            </w:tcBorders>
+            <w:tcMar>
+              <w:top w:type="dxa" w:w="70"/>
+              <w:left w:type="dxa" w:w="100"/>
+              <w:bottom w:type="dxa" w:w="70"/>
+              <w:right w:type="dxa" w:w="100"/>
+            </w:tcMar>
+          </w:tcPr>
+          <w:p>
+            <w:pPr>
+              <w:spacing w:after="40" w:line="260"/>
+            </w:pPr>
+            <w:r>
+              <w:rPr>
+                <w:sz w:val="19"/>
+                <w:szCs w:val="19"/>
+              </w:rPr>
+              <w:t xml:space="preserve">Registry</w:t>
+            </w:r>
+          </w:p>
+        </w:tc>
+        <w:tc>
+          <w:tcPr>
+            <w:tcW w:type="dxa" w:w="3000"/>
+            <w:tcBorders>
+              <w:top w:val="single" w:color="C9D1DC" w:sz="4"/>
+              <w:left w:val="single" w:color="C9D1DC" w:sz="4"/>
+              <w:bottom w:val="single" w:color="C9D1DC" w:sz="4"/>
+              <w:right w:val="single" w:color="C9D1DC" w:sz="4"/>
+            </w:tcBorders>
+            <w:tcMar>
+              <w:top w:type="dxa" w:w="70"/>
+              <w:left w:type="dxa" w:w="100"/>
+              <w:bottom w:type="dxa" w:w="70"/>
+              <w:right w:type="dxa" w:w="100"/>
+            </w:tcMar>
+          </w:tcPr>
+          <w:p>
+            <w:pPr>
+              <w:spacing w:after="40" w:line="260"/>
+            </w:pPr>
+            <w:r>
+              <w:rPr>
+                <w:rFonts w:ascii="Consolas" w:cs="Consolas" w:eastAsia="Consolas" w:hAnsi="Consolas"/>
+                <w:sz w:val="17"/>
+                <w:szCs w:val="17"/>
+              </w:rPr>
               <w:t xml:space="preserve">GET /audit</w:t>
             </w:r>
           </w:p>
@@ -15462,6 +16628,36 @@
       </w:pPr>
       <w:r>
         <w:t xml:space="preserve">All of these are built. A form post redirects to a page on success, and a request that cannot be carried out returns a page with the matching status code. The ledger checks its whole file at startup and does not start if a link, entry hash or signature is wrong. It allows cross-origin GET requests, and only GET, so the static browser verifier can read it.</w:t>
+      </w:r>
+    </w:p>
+    <w:p>
+      <w:pPr>
+        <w:spacing w:after="140" w:line="288"/>
+      </w:pPr>
+      <w:r>
+        <w:t xml:space="preserve">Every registry route except </w:t>
+      </w:r>
+      <w:r>
+        <w:rPr>
+          <w:rFonts w:ascii="Consolas" w:cs="Consolas" w:eastAsia="Consolas" w:hAnsi="Consolas"/>
+          <w:sz w:val="20"/>
+          <w:szCs w:val="20"/>
+        </w:rPr>
+        <w:t xml:space="preserve">/verify</w:t>
+      </w:r>
+      <w:r>
+        <w:t xml:space="preserve">, </w:t>
+      </w:r>
+      <w:r>
+        <w:rPr>
+          <w:rFonts w:ascii="Consolas" w:cs="Consolas" w:eastAsia="Consolas" w:hAnsi="Consolas"/>
+          <w:sz w:val="20"/>
+          <w:szCs w:val="20"/>
+        </w:rPr>
+        <w:t xml:space="preserve">/login</w:t>
+      </w:r>
+      <w:r>
+        <w:t xml:space="preserve"> and the static files needs a session. Without one, a page redirects to the login page and returns to where it was asked for after signing in. Every GET on the ledger is open.</w:t>
       </w:r>
     </w:p>
     <w:tbl>
@@ -15580,7 +16776,7 @@
                 <w:sz w:val="19"/>
                 <w:szCs w:val="19"/>
               </w:rPr>
-              <w:t xml:space="preserve">Register</w:t>
+              <w:t xml:space="preserve">Custodian Login</w:t>
             </w:r>
           </w:p>
         </w:tc>
@@ -15609,7 +16805,7 @@
                 <w:sz w:val="19"/>
                 <w:szCs w:val="19"/>
               </w:rPr>
-              <w:t xml:space="preserve">Upload form, live fingerprint, AI suggestions beside editable fields, Confirm button</w:t>
+              <w:t xml:space="preserve">Username and password. Accounts are created from the command line; there is no sign-up page.</w:t>
             </w:r>
           </w:p>
         </w:tc>
@@ -15643,6 +16839,69 @@
                 <w:sz w:val="19"/>
                 <w:szCs w:val="19"/>
               </w:rPr>
+              <w:t xml:space="preserve">Register</w:t>
+            </w:r>
+          </w:p>
+        </w:tc>
+        <w:tc>
+          <w:tcPr>
+            <w:tcW w:type="dxa" w:w="6726"/>
+            <w:tcBorders>
+              <w:top w:val="single" w:color="C9D1DC" w:sz="4"/>
+              <w:left w:val="single" w:color="C9D1DC" w:sz="4"/>
+              <w:bottom w:val="single" w:color="C9D1DC" w:sz="4"/>
+              <w:right w:val="single" w:color="C9D1DC" w:sz="4"/>
+            </w:tcBorders>
+            <w:tcMar>
+              <w:top w:type="dxa" w:w="70"/>
+              <w:left w:type="dxa" w:w="100"/>
+              <w:bottom w:type="dxa" w:w="70"/>
+              <w:right w:type="dxa" w:w="100"/>
+            </w:tcMar>
+          </w:tcPr>
+          <w:p>
+            <w:pPr>
+              <w:spacing w:after="40" w:line="260"/>
+            </w:pPr>
+            <w:r>
+              <w:rPr>
+                <w:sz w:val="19"/>
+                <w:szCs w:val="19"/>
+              </w:rPr>
+              <w:t xml:space="preserve">Upload form, live fingerprint, a warning when the content is already registered, AI suggestions beside editable fields, the account the confirmation will be recorded under, Confirm and Discard buttons</w:t>
+            </w:r>
+          </w:p>
+        </w:tc>
+      </w:tr>
+      <w:tr>
+        <w:trPr>
+          <w:cantSplit/>
+        </w:trPr>
+        <w:tc>
+          <w:tcPr>
+            <w:tcW w:type="dxa" w:w="2300"/>
+            <w:tcBorders>
+              <w:top w:val="single" w:color="C9D1DC" w:sz="4"/>
+              <w:left w:val="single" w:color="C9D1DC" w:sz="4"/>
+              <w:bottom w:val="single" w:color="C9D1DC" w:sz="4"/>
+              <w:right w:val="single" w:color="C9D1DC" w:sz="4"/>
+            </w:tcBorders>
+            <w:tcMar>
+              <w:top w:type="dxa" w:w="70"/>
+              <w:left w:type="dxa" w:w="100"/>
+              <w:bottom w:type="dxa" w:w="70"/>
+              <w:right w:type="dxa" w:w="100"/>
+            </w:tcMar>
+          </w:tcPr>
+          <w:p>
+            <w:pPr>
+              <w:spacing w:after="40" w:line="260"/>
+            </w:pPr>
+            <w:r>
+              <w:rPr>
+                <w:sz w:val="19"/>
+                <w:szCs w:val="19"/>
+              </w:rPr>
               <w:t xml:space="preserve">Records and batches</w:t>
             </w:r>
           </w:p>
@@ -15672,7 +16931,7 @@
                 <w:sz w:val="19"/>
                 <w:szCs w:val="19"/>
               </w:rPr>
-              <w:t xml:space="preserve">Open batch, sealed batches with roots and ledger sequence, proof download per record</w:t>
+              <w:t xml:space="preserve">Your batches first and other custodians' batches below, each with its owner, who sealed it, root and ledger sequence. A Seal button on the open batches you may seal; proof download per record.</w:t>
             </w:r>
           </w:p>
         </w:tc>
@@ -15993,7 +17252,22 @@
                 <w:sz w:val="19"/>
                 <w:szCs w:val="19"/>
               </w:rPr>
-              <w:t xml:space="preserve">. Needs an empty database, or </w:t>
+              <w:t xml:space="preserve">. Creates a staff account named </w:t>
+            </w:r>
+            <w:r>
+              <w:rPr>
+                <w:rFonts w:ascii="Consolas" w:cs="Consolas" w:eastAsia="Consolas" w:hAnsi="Consolas"/>
+                <w:sz w:val="17"/>
+                <w:szCs w:val="17"/>
+              </w:rPr>
+              <w:t xml:space="preserve">demo</w:t>
+            </w:r>
+            <w:r>
+              <w:rPr>
+                <w:sz w:val="19"/>
+                <w:szCs w:val="19"/>
+              </w:rPr>
+              <w:t xml:space="preserve">, which owns and seals the batch, and prints its random password once. Needs the ledger token in its terminal, and an empty database or </w:t>
             </w:r>
             <w:r>
               <w:rPr>
@@ -16419,7 +17693,353 @@
         <w:spacing w:after="140" w:line="288"/>
       </w:pPr>
       <w:r>
-        <w:t xml:space="preserve">The seed script confirms its sample records itself, standing in for the person who would normally check them. That is acceptable for demo data only.</w:t>
+        <w:t xml:space="preserve">The seed script confirms its sample records itself, under the demo account, standing in for the person who would normally check them. That is acceptable for demo data only.</w:t>
+      </w:r>
+    </w:p>
+    <w:p>
+      <w:pPr>
+        <w:pStyle w:val="Heading3"/>
+      </w:pPr>
+      <w:r>
+        <w:t xml:space="preserve">Account command</w:t>
+      </w:r>
+    </w:p>
+    <w:tbl>
+      <w:tblPr>
+        <w:tblW w:type="dxa" w:w="9026"/>
+        <w:tblBorders>
+          <w:top w:val="single" w:color="auto" w:sz="4"/>
+          <w:left w:val="single" w:color="auto" w:sz="4"/>
+          <w:bottom w:val="single" w:color="auto" w:sz="4"/>
+          <w:right w:val="single" w:color="auto" w:sz="4"/>
+          <w:insideH w:val="single" w:color="auto" w:sz="4"/>
+          <w:insideV w:val="single" w:color="auto" w:sz="4"/>
+        </w:tblBorders>
+      </w:tblPr>
+      <w:tblGrid>
+        <w:gridCol w:w="4300"/>
+        <w:gridCol w:w="4726"/>
+      </w:tblGrid>
+      <w:tr>
+        <w:trPr>
+          <w:tblHeader/>
+        </w:trPr>
+        <w:tc>
+          <w:tcPr>
+            <w:tcW w:type="dxa" w:w="4300"/>
+            <w:tcBorders>
+              <w:top w:val="single" w:color="C9D1DC" w:sz="4"/>
+              <w:left w:val="single" w:color="C9D1DC" w:sz="4"/>
+              <w:bottom w:val="single" w:color="C9D1DC" w:sz="4"/>
+              <w:right w:val="single" w:color="C9D1DC" w:sz="4"/>
+            </w:tcBorders>
+            <w:shd w:fill="1F2A44" w:val="clear"/>
+            <w:tcMar>
+              <w:top w:type="dxa" w:w="70"/>
+              <w:left w:type="dxa" w:w="100"/>
+              <w:bottom w:type="dxa" w:w="70"/>
+              <w:right w:type="dxa" w:w="100"/>
+            </w:tcMar>
+          </w:tcPr>
+          <w:p>
+            <w:pPr>
+              <w:spacing w:after="40" w:line="260"/>
+            </w:pPr>
+            <w:r>
+              <w:rPr>
+                <w:b/>
+                <w:bCs/>
+                <w:color w:val="FFFFFF"/>
+                <w:sz w:val="19"/>
+                <w:szCs w:val="19"/>
+              </w:rPr>
+              <w:t xml:space="preserve">Command</w:t>
+            </w:r>
+          </w:p>
+        </w:tc>
+        <w:tc>
+          <w:tcPr>
+            <w:tcW w:type="dxa" w:w="4726"/>
+            <w:tcBorders>
+              <w:top w:val="single" w:color="C9D1DC" w:sz="4"/>
+              <w:left w:val="single" w:color="C9D1DC" w:sz="4"/>
+              <w:bottom w:val="single" w:color="C9D1DC" w:sz="4"/>
+              <w:right w:val="single" w:color="C9D1DC" w:sz="4"/>
+            </w:tcBorders>
+            <w:shd w:fill="1F2A44" w:val="clear"/>
+            <w:tcMar>
+              <w:top w:type="dxa" w:w="70"/>
+              <w:left w:type="dxa" w:w="100"/>
+              <w:bottom w:type="dxa" w:w="70"/>
+              <w:right w:type="dxa" w:w="100"/>
+            </w:tcMar>
+          </w:tcPr>
+          <w:p>
+            <w:pPr>
+              <w:spacing w:after="40" w:line="260"/>
+            </w:pPr>
+            <w:r>
+              <w:rPr>
+                <w:b/>
+                <w:bCs/>
+                <w:color w:val="FFFFFF"/>
+                <w:sz w:val="19"/>
+                <w:szCs w:val="19"/>
+              </w:rPr>
+              <w:t xml:space="preserve">What it does</w:t>
+            </w:r>
+          </w:p>
+        </w:tc>
+      </w:tr>
+      <w:tr>
+        <w:trPr>
+          <w:cantSplit/>
+        </w:trPr>
+        <w:tc>
+          <w:tcPr>
+            <w:tcW w:type="dxa" w:w="4300"/>
+            <w:tcBorders>
+              <w:top w:val="single" w:color="C9D1DC" w:sz="4"/>
+              <w:left w:val="single" w:color="C9D1DC" w:sz="4"/>
+              <w:bottom w:val="single" w:color="C9D1DC" w:sz="4"/>
+              <w:right w:val="single" w:color="C9D1DC" w:sz="4"/>
+            </w:tcBorders>
+            <w:tcMar>
+              <w:top w:type="dxa" w:w="70"/>
+              <w:left w:type="dxa" w:w="100"/>
+              <w:bottom w:type="dxa" w:w="70"/>
+              <w:right w:type="dxa" w:w="100"/>
+            </w:tcMar>
+          </w:tcPr>
+          <w:p>
+            <w:pPr>
+              <w:spacing w:after="40" w:line="260"/>
+            </w:pPr>
+            <w:r>
+              <w:rPr>
+                <w:rFonts w:ascii="Consolas" w:cs="Consolas" w:eastAsia="Consolas" w:hAnsi="Consolas"/>
+                <w:sz w:val="17"/>
+                <w:szCs w:val="17"/>
+              </w:rPr>
+              <w:t xml:space="preserve">python -m proofchain.registry.staff add &lt;username&gt;</w:t>
+            </w:r>
+          </w:p>
+        </w:tc>
+        <w:tc>
+          <w:tcPr>
+            <w:tcW w:type="dxa" w:w="4726"/>
+            <w:tcBorders>
+              <w:top w:val="single" w:color="C9D1DC" w:sz="4"/>
+              <w:left w:val="single" w:color="C9D1DC" w:sz="4"/>
+              <w:bottom w:val="single" w:color="C9D1DC" w:sz="4"/>
+              <w:right w:val="single" w:color="C9D1DC" w:sz="4"/>
+            </w:tcBorders>
+            <w:tcMar>
+              <w:top w:type="dxa" w:w="70"/>
+              <w:left w:type="dxa" w:w="100"/>
+              <w:bottom w:type="dxa" w:w="70"/>
+              <w:right w:type="dxa" w:w="100"/>
+            </w:tcMar>
+          </w:tcPr>
+          <w:p>
+            <w:pPr>
+              <w:spacing w:after="40" w:line="260"/>
+            </w:pPr>
+            <w:r>
+              <w:rPr>
+                <w:sz w:val="19"/>
+                <w:szCs w:val="19"/>
+              </w:rPr>
+              <w:t xml:space="preserve">Creates an account and asks for its password. </w:t>
+            </w:r>
+            <w:r>
+              <w:rPr>
+                <w:rFonts w:ascii="Consolas" w:cs="Consolas" w:eastAsia="Consolas" w:hAnsi="Consolas"/>
+                <w:sz w:val="17"/>
+                <w:szCs w:val="17"/>
+              </w:rPr>
+              <w:t xml:space="preserve">--admin</w:t>
+            </w:r>
+            <w:r>
+              <w:rPr>
+                <w:sz w:val="19"/>
+                <w:szCs w:val="19"/>
+              </w:rPr>
+              <w:t xml:space="preserve"> makes it an admin; </w:t>
+            </w:r>
+            <w:r>
+              <w:rPr>
+                <w:rFonts w:ascii="Consolas" w:cs="Consolas" w:eastAsia="Consolas" w:hAnsi="Consolas"/>
+                <w:sz w:val="17"/>
+                <w:szCs w:val="17"/>
+              </w:rPr>
+              <w:t xml:space="preserve">--reset</w:t>
+            </w:r>
+            <w:r>
+              <w:rPr>
+                <w:sz w:val="19"/>
+                <w:szCs w:val="19"/>
+              </w:rPr>
+              <w:t xml:space="preserve"> changes the password of an existing account.</w:t>
+            </w:r>
+          </w:p>
+        </w:tc>
+      </w:tr>
+      <w:tr>
+        <w:trPr>
+          <w:cantSplit/>
+        </w:trPr>
+        <w:tc>
+          <w:tcPr>
+            <w:tcW w:type="dxa" w:w="4300"/>
+            <w:tcBorders>
+              <w:top w:val="single" w:color="C9D1DC" w:sz="4"/>
+              <w:left w:val="single" w:color="C9D1DC" w:sz="4"/>
+              <w:bottom w:val="single" w:color="C9D1DC" w:sz="4"/>
+              <w:right w:val="single" w:color="C9D1DC" w:sz="4"/>
+            </w:tcBorders>
+            <w:tcMar>
+              <w:top w:type="dxa" w:w="70"/>
+              <w:left w:type="dxa" w:w="100"/>
+              <w:bottom w:type="dxa" w:w="70"/>
+              <w:right w:type="dxa" w:w="100"/>
+            </w:tcMar>
+          </w:tcPr>
+          <w:p>
+            <w:pPr>
+              <w:spacing w:after="40" w:line="260"/>
+            </w:pPr>
+            <w:r>
+              <w:rPr>
+                <w:rFonts w:ascii="Consolas" w:cs="Consolas" w:eastAsia="Consolas" w:hAnsi="Consolas"/>
+                <w:sz w:val="17"/>
+                <w:szCs w:val="17"/>
+              </w:rPr>
+              <w:t xml:space="preserve">python -m proofchain.registry.staff admin &lt;username&gt;</w:t>
+            </w:r>
+          </w:p>
+        </w:tc>
+        <w:tc>
+          <w:tcPr>
+            <w:tcW w:type="dxa" w:w="4726"/>
+            <w:tcBorders>
+              <w:top w:val="single" w:color="C9D1DC" w:sz="4"/>
+              <w:left w:val="single" w:color="C9D1DC" w:sz="4"/>
+              <w:bottom w:val="single" w:color="C9D1DC" w:sz="4"/>
+              <w:right w:val="single" w:color="C9D1DC" w:sz="4"/>
+            </w:tcBorders>
+            <w:tcMar>
+              <w:top w:type="dxa" w:w="70"/>
+              <w:left w:type="dxa" w:w="100"/>
+              <w:bottom w:type="dxa" w:w="70"/>
+              <w:right w:type="dxa" w:w="100"/>
+            </w:tcMar>
+          </w:tcPr>
+          <w:p>
+            <w:pPr>
+              <w:spacing w:after="40" w:line="260"/>
+            </w:pPr>
+            <w:r>
+              <w:rPr>
+                <w:sz w:val="19"/>
+                <w:szCs w:val="19"/>
+              </w:rPr>
+              <w:t xml:space="preserve">Makes an existing account an admin, who may seal any open batch. </w:t>
+            </w:r>
+            <w:r>
+              <w:rPr>
+                <w:rFonts w:ascii="Consolas" w:cs="Consolas" w:eastAsia="Consolas" w:hAnsi="Consolas"/>
+                <w:sz w:val="17"/>
+                <w:szCs w:val="17"/>
+              </w:rPr>
+              <w:t xml:space="preserve">--revoke</w:t>
+            </w:r>
+            <w:r>
+              <w:rPr>
+                <w:sz w:val="19"/>
+                <w:szCs w:val="19"/>
+              </w:rPr>
+              <w:t xml:space="preserve"> undoes it.</w:t>
+            </w:r>
+          </w:p>
+        </w:tc>
+      </w:tr>
+      <w:tr>
+        <w:trPr>
+          <w:cantSplit/>
+        </w:trPr>
+        <w:tc>
+          <w:tcPr>
+            <w:tcW w:type="dxa" w:w="4300"/>
+            <w:tcBorders>
+              <w:top w:val="single" w:color="C9D1DC" w:sz="4"/>
+              <w:left w:val="single" w:color="C9D1DC" w:sz="4"/>
+              <w:bottom w:val="single" w:color="C9D1DC" w:sz="4"/>
+              <w:right w:val="single" w:color="C9D1DC" w:sz="4"/>
+            </w:tcBorders>
+            <w:tcMar>
+              <w:top w:type="dxa" w:w="70"/>
+              <w:left w:type="dxa" w:w="100"/>
+              <w:bottom w:type="dxa" w:w="70"/>
+              <w:right w:type="dxa" w:w="100"/>
+            </w:tcMar>
+          </w:tcPr>
+          <w:p>
+            <w:pPr>
+              <w:spacing w:after="40" w:line="260"/>
+            </w:pPr>
+            <w:r>
+              <w:rPr>
+                <w:rFonts w:ascii="Consolas" w:cs="Consolas" w:eastAsia="Consolas" w:hAnsi="Consolas"/>
+                <w:sz w:val="17"/>
+                <w:szCs w:val="17"/>
+              </w:rPr>
+              <w:t xml:space="preserve">python -m proofchain.registry.staff list</w:t>
+            </w:r>
+          </w:p>
+        </w:tc>
+        <w:tc>
+          <w:tcPr>
+            <w:tcW w:type="dxa" w:w="4726"/>
+            <w:tcBorders>
+              <w:top w:val="single" w:color="C9D1DC" w:sz="4"/>
+              <w:left w:val="single" w:color="C9D1DC" w:sz="4"/>
+              <w:bottom w:val="single" w:color="C9D1DC" w:sz="4"/>
+              <w:right w:val="single" w:color="C9D1DC" w:sz="4"/>
+            </w:tcBorders>
+            <w:tcMar>
+              <w:top w:type="dxa" w:w="70"/>
+              <w:left w:type="dxa" w:w="100"/>
+              <w:bottom w:type="dxa" w:w="70"/>
+              <w:right w:type="dxa" w:w="100"/>
+            </w:tcMar>
+          </w:tcPr>
+          <w:p>
+            <w:pPr>
+              <w:spacing w:after="40" w:line="260"/>
+            </w:pPr>
+            <w:r>
+              <w:rPr>
+                <w:sz w:val="19"/>
+                <w:szCs w:val="19"/>
+              </w:rPr>
+              <w:t xml:space="preserve">Shows the accounts and which are admins.</w:t>
+            </w:r>
+          </w:p>
+        </w:tc>
+      </w:tr>
+    </w:tbl>
+    <w:p>
+      <w:pPr>
+        <w:spacing w:after="160"/>
+      </w:pPr>
+    </w:p>
+    <w:p>
+      <w:pPr>
+        <w:spacing w:after="140" w:line="288"/>
+      </w:pPr>
+      <w:r>
+        <w:t xml:space="preserve">Nothing reachable over HTTP can create an account or make one an admin.</w:t>
       </w:r>
     </w:p>
     <w:p>
@@ -16490,7 +18110,7 @@
         <w:spacing w:after="70" w:line="280"/>
       </w:pPr>
       <w:r>
-        <w:t xml:space="preserve">AI output is stored as a suggestion. Only the Confirm action, taken by a person who gives their name, writes metadata. There is no login yet.</w:t>
+        <w:t xml:space="preserve">AI output is stored as a suggestion. Only the Confirm action, taken by a signed-in staff member, writes metadata, and the record keeps that account's name.</w:t>
       </w:r>
     </w:p>
     <w:p>
@@ -18572,7 +20192,7 @@
                 <w:sz w:val="17"/>
                 <w:szCs w:val="17"/>
               </w:rPr>
-              <w:t xml:space="preserve">test_registry.py</w:t>
+              <w:t xml:space="preserve">test_salted_leaves.py</w:t>
             </w:r>
           </w:p>
         </w:tc>
@@ -18601,7 +20221,7 @@
                 <w:sz w:val="19"/>
                 <w:szCs w:val="19"/>
               </w:rPr>
-              <w:t xml:space="preserve">Upload, confirm, seal, proofs, the Verify page, the AI hooks, the real HTTP client</w:t>
+              <w:t xml:space="preserve">The salted leaf value, version 2 proofs, distinct leaves for repeated content, the duplicate warning</w:t>
             </w:r>
           </w:p>
         </w:tc>
@@ -18665,7 +20285,7 @@
                 <w:sz w:val="17"/>
                 <w:szCs w:val="17"/>
               </w:rPr>
-              <w:t xml:space="preserve">test_audit.py</w:t>
+              <w:t xml:space="preserve">test_registry.py</w:t>
             </w:r>
           </w:p>
         </w:tc>
@@ -18694,7 +20314,7 @@
                 <w:sz w:val="19"/>
                 <w:szCs w:val="19"/>
               </w:rPr>
-              <w:t xml:space="preserve">The three audit codes, a diverged or unknown batch, a rewritten ledger, invalid stored values</w:t>
+              <w:t xml:space="preserve">Upload, confirm, seal, proofs, the Verify page, the AI hooks, the real HTTP client</w:t>
             </w:r>
           </w:p>
         </w:tc>
@@ -18758,7 +20378,7 @@
                 <w:sz w:val="17"/>
                 <w:szCs w:val="17"/>
               </w:rPr>
-              <w:t xml:space="preserve">test_ai_independence.py</w:t>
+              <w:t xml:space="preserve">test_auth.py</w:t>
             </w:r>
           </w:p>
         </w:tc>
@@ -18787,7 +20407,7 @@
                 <w:sz w:val="19"/>
                 <w:szCs w:val="19"/>
               </w:rPr>
-              <w:t xml:space="preserve">Rules and fixed wording, requests sent to Claude, every fallback, same verdict with and without a key</w:t>
+              <w:t xml:space="preserve">Sign-in, protected routes, forged and expired cookies, the confirmer taken from the session, the ledger token, and everything that must stay public</w:t>
             </w:r>
           </w:p>
         </w:tc>
@@ -18851,6 +20471,285 @@
                 <w:sz w:val="17"/>
                 <w:szCs w:val="17"/>
               </w:rPr>
+              <w:t xml:space="preserve">test_batches.py</w:t>
+            </w:r>
+          </w:p>
+        </w:tc>
+        <w:tc>
+          <w:tcPr>
+            <w:tcW w:type="dxa" w:w="4526"/>
+            <w:tcBorders>
+              <w:top w:val="single" w:color="C9D1DC" w:sz="4"/>
+              <w:left w:val="single" w:color="C9D1DC" w:sz="4"/>
+              <w:bottom w:val="single" w:color="C9D1DC" w:sz="4"/>
+              <w:right w:val="single" w:color="C9D1DC" w:sz="4"/>
+            </w:tcBorders>
+            <w:tcMar>
+              <w:top w:type="dxa" w:w="70"/>
+              <w:left w:type="dxa" w:w="100"/>
+              <w:bottom w:type="dxa" w:w="70"/>
+              <w:right w:type="dxa" w:w="100"/>
+            </w:tcMar>
+          </w:tcPr>
+          <w:p>
+            <w:pPr>
+              <w:spacing w:after="40" w:line="260"/>
+            </w:pPr>
+            <w:r>
+              <w:rPr>
+                <w:sz w:val="19"/>
+                <w:szCs w:val="19"/>
+              </w:rPr>
+              <w:t xml:space="preserve">One open batch per custodian, confirming at the same time, who may seal, admin accounts, upgrading an older database</w:t>
+            </w:r>
+          </w:p>
+        </w:tc>
+        <w:tc>
+          <w:tcPr>
+            <w:tcW w:type="dxa" w:w="1500"/>
+            <w:tcBorders>
+              <w:top w:val="single" w:color="C9D1DC" w:sz="4"/>
+              <w:left w:val="single" w:color="C9D1DC" w:sz="4"/>
+              <w:bottom w:val="single" w:color="C9D1DC" w:sz="4"/>
+              <w:right w:val="single" w:color="C9D1DC" w:sz="4"/>
+            </w:tcBorders>
+            <w:tcMar>
+              <w:top w:type="dxa" w:w="70"/>
+              <w:left w:type="dxa" w:w="100"/>
+              <w:bottom w:type="dxa" w:w="70"/>
+              <w:right w:type="dxa" w:w="100"/>
+            </w:tcMar>
+          </w:tcPr>
+          <w:p>
+            <w:pPr>
+              <w:spacing w:after="40" w:line="260"/>
+            </w:pPr>
+            <w:r>
+              <w:rPr>
+                <w:sz w:val="19"/>
+                <w:szCs w:val="19"/>
+              </w:rPr>
+              <w:t xml:space="preserve">Passing</w:t>
+            </w:r>
+          </w:p>
+        </w:tc>
+      </w:tr>
+      <w:tr>
+        <w:trPr>
+          <w:cantSplit/>
+        </w:trPr>
+        <w:tc>
+          <w:tcPr>
+            <w:tcW w:type="dxa" w:w="3000"/>
+            <w:tcBorders>
+              <w:top w:val="single" w:color="C9D1DC" w:sz="4"/>
+              <w:left w:val="single" w:color="C9D1DC" w:sz="4"/>
+              <w:bottom w:val="single" w:color="C9D1DC" w:sz="4"/>
+              <w:right w:val="single" w:color="C9D1DC" w:sz="4"/>
+            </w:tcBorders>
+            <w:tcMar>
+              <w:top w:type="dxa" w:w="70"/>
+              <w:left w:type="dxa" w:w="100"/>
+              <w:bottom w:type="dxa" w:w="70"/>
+              <w:right w:type="dxa" w:w="100"/>
+            </w:tcMar>
+          </w:tcPr>
+          <w:p>
+            <w:pPr>
+              <w:spacing w:after="40" w:line="260"/>
+            </w:pPr>
+            <w:r>
+              <w:rPr>
+                <w:rFonts w:ascii="Consolas" w:cs="Consolas" w:eastAsia="Consolas" w:hAnsi="Consolas"/>
+                <w:sz w:val="17"/>
+                <w:szCs w:val="17"/>
+              </w:rPr>
+              <w:t xml:space="preserve">test_audit.py</w:t>
+            </w:r>
+          </w:p>
+        </w:tc>
+        <w:tc>
+          <w:tcPr>
+            <w:tcW w:type="dxa" w:w="4526"/>
+            <w:tcBorders>
+              <w:top w:val="single" w:color="C9D1DC" w:sz="4"/>
+              <w:left w:val="single" w:color="C9D1DC" w:sz="4"/>
+              <w:bottom w:val="single" w:color="C9D1DC" w:sz="4"/>
+              <w:right w:val="single" w:color="C9D1DC" w:sz="4"/>
+            </w:tcBorders>
+            <w:tcMar>
+              <w:top w:type="dxa" w:w="70"/>
+              <w:left w:type="dxa" w:w="100"/>
+              <w:bottom w:type="dxa" w:w="70"/>
+              <w:right w:type="dxa" w:w="100"/>
+            </w:tcMar>
+          </w:tcPr>
+          <w:p>
+            <w:pPr>
+              <w:spacing w:after="40" w:line="260"/>
+            </w:pPr>
+            <w:r>
+              <w:rPr>
+                <w:sz w:val="19"/>
+                <w:szCs w:val="19"/>
+              </w:rPr>
+              <w:t xml:space="preserve">The three audit codes, a diverged or unknown batch, a rewritten ledger, invalid stored values</w:t>
+            </w:r>
+          </w:p>
+        </w:tc>
+        <w:tc>
+          <w:tcPr>
+            <w:tcW w:type="dxa" w:w="1500"/>
+            <w:tcBorders>
+              <w:top w:val="single" w:color="C9D1DC" w:sz="4"/>
+              <w:left w:val="single" w:color="C9D1DC" w:sz="4"/>
+              <w:bottom w:val="single" w:color="C9D1DC" w:sz="4"/>
+              <w:right w:val="single" w:color="C9D1DC" w:sz="4"/>
+            </w:tcBorders>
+            <w:tcMar>
+              <w:top w:type="dxa" w:w="70"/>
+              <w:left w:type="dxa" w:w="100"/>
+              <w:bottom w:type="dxa" w:w="70"/>
+              <w:right w:type="dxa" w:w="100"/>
+            </w:tcMar>
+          </w:tcPr>
+          <w:p>
+            <w:pPr>
+              <w:spacing w:after="40" w:line="260"/>
+            </w:pPr>
+            <w:r>
+              <w:rPr>
+                <w:sz w:val="19"/>
+                <w:szCs w:val="19"/>
+              </w:rPr>
+              <w:t xml:space="preserve">Passing</w:t>
+            </w:r>
+          </w:p>
+        </w:tc>
+      </w:tr>
+      <w:tr>
+        <w:trPr>
+          <w:cantSplit/>
+        </w:trPr>
+        <w:tc>
+          <w:tcPr>
+            <w:tcW w:type="dxa" w:w="3000"/>
+            <w:tcBorders>
+              <w:top w:val="single" w:color="C9D1DC" w:sz="4"/>
+              <w:left w:val="single" w:color="C9D1DC" w:sz="4"/>
+              <w:bottom w:val="single" w:color="C9D1DC" w:sz="4"/>
+              <w:right w:val="single" w:color="C9D1DC" w:sz="4"/>
+            </w:tcBorders>
+            <w:tcMar>
+              <w:top w:type="dxa" w:w="70"/>
+              <w:left w:type="dxa" w:w="100"/>
+              <w:bottom w:type="dxa" w:w="70"/>
+              <w:right w:type="dxa" w:w="100"/>
+            </w:tcMar>
+          </w:tcPr>
+          <w:p>
+            <w:pPr>
+              <w:spacing w:after="40" w:line="260"/>
+            </w:pPr>
+            <w:r>
+              <w:rPr>
+                <w:rFonts w:ascii="Consolas" w:cs="Consolas" w:eastAsia="Consolas" w:hAnsi="Consolas"/>
+                <w:sz w:val="17"/>
+                <w:szCs w:val="17"/>
+              </w:rPr>
+              <w:t xml:space="preserve">test_ai_independence.py</w:t>
+            </w:r>
+          </w:p>
+        </w:tc>
+        <w:tc>
+          <w:tcPr>
+            <w:tcW w:type="dxa" w:w="4526"/>
+            <w:tcBorders>
+              <w:top w:val="single" w:color="C9D1DC" w:sz="4"/>
+              <w:left w:val="single" w:color="C9D1DC" w:sz="4"/>
+              <w:bottom w:val="single" w:color="C9D1DC" w:sz="4"/>
+              <w:right w:val="single" w:color="C9D1DC" w:sz="4"/>
+            </w:tcBorders>
+            <w:tcMar>
+              <w:top w:type="dxa" w:w="70"/>
+              <w:left w:type="dxa" w:w="100"/>
+              <w:bottom w:type="dxa" w:w="70"/>
+              <w:right w:type="dxa" w:w="100"/>
+            </w:tcMar>
+          </w:tcPr>
+          <w:p>
+            <w:pPr>
+              <w:spacing w:after="40" w:line="260"/>
+            </w:pPr>
+            <w:r>
+              <w:rPr>
+                <w:sz w:val="19"/>
+                <w:szCs w:val="19"/>
+              </w:rPr>
+              <w:t xml:space="preserve">Rules and fixed wording, requests sent to Claude, every fallback, same verdict with and without a key</w:t>
+            </w:r>
+          </w:p>
+        </w:tc>
+        <w:tc>
+          <w:tcPr>
+            <w:tcW w:type="dxa" w:w="1500"/>
+            <w:tcBorders>
+              <w:top w:val="single" w:color="C9D1DC" w:sz="4"/>
+              <w:left w:val="single" w:color="C9D1DC" w:sz="4"/>
+              <w:bottom w:val="single" w:color="C9D1DC" w:sz="4"/>
+              <w:right w:val="single" w:color="C9D1DC" w:sz="4"/>
+            </w:tcBorders>
+            <w:tcMar>
+              <w:top w:type="dxa" w:w="70"/>
+              <w:left w:type="dxa" w:w="100"/>
+              <w:bottom w:type="dxa" w:w="70"/>
+              <w:right w:type="dxa" w:w="100"/>
+            </w:tcMar>
+          </w:tcPr>
+          <w:p>
+            <w:pPr>
+              <w:spacing w:after="40" w:line="260"/>
+            </w:pPr>
+            <w:r>
+              <w:rPr>
+                <w:sz w:val="19"/>
+                <w:szCs w:val="19"/>
+              </w:rPr>
+              <w:t xml:space="preserve">Passing</w:t>
+            </w:r>
+          </w:p>
+        </w:tc>
+      </w:tr>
+      <w:tr>
+        <w:trPr>
+          <w:cantSplit/>
+        </w:trPr>
+        <w:tc>
+          <w:tcPr>
+            <w:tcW w:type="dxa" w:w="3000"/>
+            <w:tcBorders>
+              <w:top w:val="single" w:color="C9D1DC" w:sz="4"/>
+              <w:left w:val="single" w:color="C9D1DC" w:sz="4"/>
+              <w:bottom w:val="single" w:color="C9D1DC" w:sz="4"/>
+              <w:right w:val="single" w:color="C9D1DC" w:sz="4"/>
+            </w:tcBorders>
+            <w:tcMar>
+              <w:top w:type="dxa" w:w="70"/>
+              <w:left w:type="dxa" w:w="100"/>
+              <w:bottom w:type="dxa" w:w="70"/>
+              <w:right w:type="dxa" w:w="100"/>
+            </w:tcMar>
+          </w:tcPr>
+          <w:p>
+            <w:pPr>
+              <w:spacing w:after="40" w:line="260"/>
+            </w:pPr>
+            <w:r>
+              <w:rPr>
+                <w:rFonts w:ascii="Consolas" w:cs="Consolas" w:eastAsia="Consolas" w:hAnsi="Consolas"/>
+                <w:sz w:val="17"/>
+                <w:szCs w:val="17"/>
+              </w:rPr>
               <w:t xml:space="preserve">test_end_to_end.py</w:t>
             </w:r>
           </w:p>
@@ -18925,7 +20824,7 @@
         <w:spacing w:after="140" w:line="288"/>
       </w:pPr>
       <w:r>
-        <w:t xml:space="preserve">500 tests pass. The two that run the browser verifier's rules need Node.js and are skipped without it. The expected values come from </w:t>
+        <w:t xml:space="preserve">697 tests pass. The two that run the browser verifier's rules need Node.js and are skipped without it. The expected values come from </w:t>
       </w:r>
       <w:r>
         <w:rPr>
@@ -18953,7 +20852,7 @@
         <w:spacing w:after="140" w:line="288"/>
       </w:pPr>
       <w:r>
-        <w:t xml:space="preserve">The base build meets the brief. These additions are ordered by how much they strengthen the project for the effort involved. The static in-browser verifier is built. The tamper demo exists as a command-line script, not yet as a page. Nothing else in this table has been built.</w:t>
+        <w:t xml:space="preserve">The base build meets the brief. These additions are ordered by how much they strengthen the project for the effort involved. The static in-browser verifier and salted leaves are built. The tamper demo exists as a command-line script, not yet as a page. Nothing else in this table has been built.</w:t>
       </w:r>
     </w:p>
     <w:tbl>
@@ -20018,7 +21917,7 @@
                 <w:sz w:val="19"/>
                 <w:szCs w:val="19"/>
               </w:rPr>
-              <w:t xml:space="preserve">A random salt per record stops anyone guessing a document's contents from its hash.</w:t>
+              <w:t xml:space="preserve">A random salt per record makes every registration a distinct leaf and stops anyone matching a sibling hash against a guessed document.</w:t>
             </w:r>
           </w:p>
         </w:tc>
@@ -20073,10 +21972,12 @@
             </w:pPr>
             <w:r>
               <w:rPr>
-                <w:sz w:val="19"/>
-                <w:szCs w:val="19"/>
-              </w:rPr>
-              <w:t xml:space="preserve">Medium</w:t>
+                <w:b/>
+                <w:bCs/>
+                <w:sz w:val="19"/>
+                <w:szCs w:val="19"/>
+              </w:rPr>
+              <w:t xml:space="preserve">Built</w:t>
             </w:r>
           </w:p>
         </w:tc>
@@ -21224,7 +23125,7 @@
                 <w:sz w:val="19"/>
                 <w:szCs w:val="19"/>
               </w:rPr>
-              <w:t xml:space="preserve">Salted leaves (Section 8)</w:t>
+              <w:t xml:space="preserve">Every record is salted, so the sibling hashes in a proof cannot be matched against guesses. A holder's own proof still contains the plain fingerprint of their own document.</w:t>
             </w:r>
           </w:p>
         </w:tc>
@@ -21258,7 +23159,7 @@
                 <w:sz w:val="19"/>
                 <w:szCs w:val="19"/>
               </w:rPr>
-              <w:t xml:space="preserve">Registry registers a false document</w:t>
+              <w:t xml:space="preserve">The same content is registered twice</w:t>
             </w:r>
           </w:p>
         </w:tc>
@@ -21287,7 +23188,7 @@
                 <w:sz w:val="19"/>
                 <w:szCs w:val="19"/>
               </w:rPr>
-              <w:t xml:space="preserve">It verifies, because it matches what was registered</w:t>
+              <w:t xml:space="preserve">Two records and two proofs exist for one document, and either proof verifies it</w:t>
             </w:r>
           </w:p>
         </w:tc>
@@ -21316,7 +23217,7 @@
                 <w:sz w:val="19"/>
                 <w:szCs w:val="19"/>
               </w:rPr>
-              <w:t xml:space="preserve">State the claim precisely; issuer signatures add accountability, not truth</w:t>
+              <w:t xml:space="preserve">The Register page warns and names the earlier record; salts make the two registrations distinct leaves; a pass means the content was registered, not which copy this is</w:t>
             </w:r>
           </w:p>
         </w:tc>
@@ -21350,7 +23251,7 @@
                 <w:sz w:val="19"/>
                 <w:szCs w:val="19"/>
               </w:rPr>
-              <w:t xml:space="preserve">AI suggests wrong metadata</w:t>
+              <w:t xml:space="preserve">A database created before salting</w:t>
             </w:r>
           </w:p>
         </w:tc>
@@ -21379,7 +23280,7 @@
                 <w:sz w:val="19"/>
                 <w:szCs w:val="19"/>
               </w:rPr>
-              <w:t xml:space="preserve">Wrong labels on a record</w:t>
+              <w:t xml:space="preserve">Its batches were built unsalted and cannot be continued</w:t>
             </w:r>
           </w:p>
         </w:tc>
@@ -21408,7 +23309,7 @@
                 <w:sz w:val="19"/>
                 <w:szCs w:val="19"/>
               </w:rPr>
-              <w:t xml:space="preserve">Human confirmation gate; metadata never affects verification</w:t>
+              <w:t xml:space="preserve">The registry refuses to start on it and says to begin from empty data; unsalted version 1 proofs still verify</w:t>
             </w:r>
           </w:p>
         </w:tc>
@@ -21442,7 +23343,7 @@
                 <w:sz w:val="19"/>
                 <w:szCs w:val="19"/>
               </w:rPr>
-              <w:t xml:space="preserve">SHA-256 weakened in future</w:t>
+              <w:t xml:space="preserve">Registry registers a false document</w:t>
             </w:r>
           </w:p>
         </w:tc>
@@ -21471,7 +23372,7 @@
                 <w:sz w:val="19"/>
                 <w:szCs w:val="19"/>
               </w:rPr>
-              <w:t xml:space="preserve">Fingerprints lose strength</w:t>
+              <w:t xml:space="preserve">It verifies, because it matches what was registered</w:t>
             </w:r>
           </w:p>
         </w:tc>
@@ -21500,7 +23401,7 @@
                 <w:sz w:val="19"/>
                 <w:szCs w:val="19"/>
               </w:rPr>
-              <w:t xml:space="preserve">Version field in proofs and ledger entries allows migration</w:t>
+              <w:t xml:space="preserve">State the claim precisely; issuer signatures add accountability, not truth</w:t>
             </w:r>
           </w:p>
         </w:tc>
@@ -21534,7 +23435,7 @@
                 <w:sz w:val="19"/>
                 <w:szCs w:val="19"/>
               </w:rPr>
-              <w:t xml:space="preserve">Anyone who can reach the ledger can append</w:t>
+              <w:t xml:space="preserve">AI suggests wrong metadata</w:t>
             </w:r>
           </w:p>
         </w:tc>
@@ -21563,7 +23464,7 @@
                 <w:sz w:val="19"/>
                 <w:szCs w:val="19"/>
               </w:rPr>
-              <w:t xml:space="preserve">A root for a new batch id could be published by someone other than the registry. No existing entry can be changed or replaced.</w:t>
+              <w:t xml:space="preserve">Wrong labels on a record</w:t>
             </w:r>
           </w:p>
         </w:tc>
@@ -21592,7 +23493,7 @@
                 <w:sz w:val="19"/>
                 <w:szCs w:val="19"/>
               </w:rPr>
-              <w:t xml:space="preserve">Acceptable on one machine; add a shared secret between registry and ledger before any shared deployment</w:t>
+              <w:t xml:space="preserve">Human confirmation gate; metadata never affects verification</w:t>
             </w:r>
           </w:p>
         </w:tc>
@@ -21626,7 +23527,7 @@
                 <w:sz w:val="19"/>
                 <w:szCs w:val="19"/>
               </w:rPr>
-              <w:t xml:space="preserve">Ledger file cut short at the end</w:t>
+              <w:t xml:space="preserve">SHA-256 weakened in future</w:t>
             </w:r>
           </w:p>
         </w:tc>
@@ -21655,7 +23556,7 @@
                 <w:sz w:val="19"/>
                 <w:szCs w:val="19"/>
               </w:rPr>
-              <w:t xml:space="preserve">The shorter file is still a sound chain, so the ledger itself starts normally</w:t>
+              <w:t xml:space="preserve">Fingerprints lose strength</w:t>
             </w:r>
           </w:p>
         </w:tc>
@@ -21684,7 +23585,7 @@
                 <w:sz w:val="19"/>
                 <w:szCs w:val="19"/>
               </w:rPr>
-              <w:t xml:space="preserve">A verifier whose pin lies beyond the cut reports LEDGER_INVALID; witnesses and backups</w:t>
+              <w:t xml:space="preserve">Version field in proofs and ledger entries allows migration</w:t>
             </w:r>
           </w:p>
         </w:tc>
@@ -21718,7 +23619,7 @@
                 <w:sz w:val="19"/>
                 <w:szCs w:val="19"/>
               </w:rPr>
-              <w:t xml:space="preserve">Public key fetched from the ledger being checked</w:t>
+              <w:t xml:space="preserve">The ledger token leaks</w:t>
             </w:r>
           </w:p>
         </w:tc>
@@ -21747,7 +23648,7 @@
                 <w:sz w:val="19"/>
                 <w:szCs w:val="19"/>
               </w:rPr>
-              <w:t xml:space="preserve">A replaced ledger could serve its own key</w:t>
+              <w:t xml:space="preserve">Whoever holds it can publish a root for a new batch id. No existing entry can be changed or replaced.</w:t>
             </w:r>
           </w:p>
         </w:tc>
@@ -21776,7 +23677,7 @@
                 <w:sz w:val="19"/>
                 <w:szCs w:val="19"/>
               </w:rPr>
-              <w:t xml:space="preserve">Use a pin file or the --pubkey option; the verifier prints a note whenever it had to fetch the key</w:t>
+              <w:t xml:space="preserve">It is sent only with an append and is kept out of Git; change it on both services if it leaks</w:t>
             </w:r>
           </w:p>
         </w:tc>
@@ -21810,7 +23711,7 @@
                 <w:sz w:val="19"/>
                 <w:szCs w:val="19"/>
               </w:rPr>
-              <w:t xml:space="preserve">Registry pages have no login</w:t>
+              <w:t xml:space="preserve">Ledger file cut short at the end</w:t>
             </w:r>
           </w:p>
         </w:tc>
@@ -21839,7 +23740,7 @@
                 <w:sz w:val="19"/>
                 <w:szCs w:val="19"/>
               </w:rPr>
-              <w:t xml:space="preserve">Anyone who can reach the registry can upload, confirm and seal; the "confirmed by" name is whatever was typed</w:t>
+              <w:t xml:space="preserve">The shorter file is still a sound chain, so the ledger itself starts normally</w:t>
             </w:r>
           </w:p>
         </w:tc>
@@ -21868,7 +23769,375 @@
                 <w:sz w:val="19"/>
                 <w:szCs w:val="19"/>
               </w:rPr>
-              <w:t xml:space="preserve">Acceptable on one machine; add sign-in before any shared deployment</w:t>
+              <w:t xml:space="preserve">A verifier whose pin lies beyond the cut reports LEDGER_INVALID; witnesses and backups</w:t>
+            </w:r>
+          </w:p>
+        </w:tc>
+      </w:tr>
+      <w:tr>
+        <w:trPr>
+          <w:cantSplit/>
+        </w:trPr>
+        <w:tc>
+          <w:tcPr>
+            <w:tcW w:type="dxa" w:w="2700"/>
+            <w:tcBorders>
+              <w:top w:val="single" w:color="C9D1DC" w:sz="4"/>
+              <w:left w:val="single" w:color="C9D1DC" w:sz="4"/>
+              <w:bottom w:val="single" w:color="C9D1DC" w:sz="4"/>
+              <w:right w:val="single" w:color="C9D1DC" w:sz="4"/>
+            </w:tcBorders>
+            <w:tcMar>
+              <w:top w:type="dxa" w:w="70"/>
+              <w:left w:type="dxa" w:w="100"/>
+              <w:bottom w:type="dxa" w:w="70"/>
+              <w:right w:type="dxa" w:w="100"/>
+            </w:tcMar>
+          </w:tcPr>
+          <w:p>
+            <w:pPr>
+              <w:spacing w:after="40" w:line="260"/>
+            </w:pPr>
+            <w:r>
+              <w:rPr>
+                <w:sz w:val="19"/>
+                <w:szCs w:val="19"/>
+              </w:rPr>
+              <w:t xml:space="preserve">Public key fetched from the ledger being checked</w:t>
+            </w:r>
+          </w:p>
+        </w:tc>
+        <w:tc>
+          <w:tcPr>
+            <w:tcW w:type="dxa" w:w="3200"/>
+            <w:tcBorders>
+              <w:top w:val="single" w:color="C9D1DC" w:sz="4"/>
+              <w:left w:val="single" w:color="C9D1DC" w:sz="4"/>
+              <w:bottom w:val="single" w:color="C9D1DC" w:sz="4"/>
+              <w:right w:val="single" w:color="C9D1DC" w:sz="4"/>
+            </w:tcBorders>
+            <w:tcMar>
+              <w:top w:type="dxa" w:w="70"/>
+              <w:left w:type="dxa" w:w="100"/>
+              <w:bottom w:type="dxa" w:w="70"/>
+              <w:right w:type="dxa" w:w="100"/>
+            </w:tcMar>
+          </w:tcPr>
+          <w:p>
+            <w:pPr>
+              <w:spacing w:after="40" w:line="260"/>
+            </w:pPr>
+            <w:r>
+              <w:rPr>
+                <w:sz w:val="19"/>
+                <w:szCs w:val="19"/>
+              </w:rPr>
+              <w:t xml:space="preserve">A replaced ledger could serve its own key</w:t>
+            </w:r>
+          </w:p>
+        </w:tc>
+        <w:tc>
+          <w:tcPr>
+            <w:tcW w:type="dxa" w:w="3126"/>
+            <w:tcBorders>
+              <w:top w:val="single" w:color="C9D1DC" w:sz="4"/>
+              <w:left w:val="single" w:color="C9D1DC" w:sz="4"/>
+              <w:bottom w:val="single" w:color="C9D1DC" w:sz="4"/>
+              <w:right w:val="single" w:color="C9D1DC" w:sz="4"/>
+            </w:tcBorders>
+            <w:tcMar>
+              <w:top w:type="dxa" w:w="70"/>
+              <w:left w:type="dxa" w:w="100"/>
+              <w:bottom w:type="dxa" w:w="70"/>
+              <w:right w:type="dxa" w:w="100"/>
+            </w:tcMar>
+          </w:tcPr>
+          <w:p>
+            <w:pPr>
+              <w:spacing w:after="40" w:line="260"/>
+            </w:pPr>
+            <w:r>
+              <w:rPr>
+                <w:sz w:val="19"/>
+                <w:szCs w:val="19"/>
+              </w:rPr>
+              <w:t xml:space="preserve">Use a pin file or the --pubkey option; the verifier prints a note whenever it had to fetch the key</w:t>
+            </w:r>
+          </w:p>
+        </w:tc>
+      </w:tr>
+      <w:tr>
+        <w:trPr>
+          <w:cantSplit/>
+        </w:trPr>
+        <w:tc>
+          <w:tcPr>
+            <w:tcW w:type="dxa" w:w="2700"/>
+            <w:tcBorders>
+              <w:top w:val="single" w:color="C9D1DC" w:sz="4"/>
+              <w:left w:val="single" w:color="C9D1DC" w:sz="4"/>
+              <w:bottom w:val="single" w:color="C9D1DC" w:sz="4"/>
+              <w:right w:val="single" w:color="C9D1DC" w:sz="4"/>
+            </w:tcBorders>
+            <w:tcMar>
+              <w:top w:type="dxa" w:w="70"/>
+              <w:left w:type="dxa" w:w="100"/>
+              <w:bottom w:type="dxa" w:w="70"/>
+              <w:right w:type="dxa" w:w="100"/>
+            </w:tcMar>
+          </w:tcPr>
+          <w:p>
+            <w:pPr>
+              <w:spacing w:after="40" w:line="260"/>
+            </w:pPr>
+            <w:r>
+              <w:rPr>
+                <w:sz w:val="19"/>
+                <w:szCs w:val="19"/>
+              </w:rPr>
+              <w:t xml:space="preserve">Sign-in is deliberately small</w:t>
+            </w:r>
+          </w:p>
+        </w:tc>
+        <w:tc>
+          <w:tcPr>
+            <w:tcW w:type="dxa" w:w="3200"/>
+            <w:tcBorders>
+              <w:top w:val="single" w:color="C9D1DC" w:sz="4"/>
+              <w:left w:val="single" w:color="C9D1DC" w:sz="4"/>
+              <w:bottom w:val="single" w:color="C9D1DC" w:sz="4"/>
+              <w:right w:val="single" w:color="C9D1DC" w:sz="4"/>
+            </w:tcBorders>
+            <w:tcMar>
+              <w:top w:type="dxa" w:w="70"/>
+              <w:left w:type="dxa" w:w="100"/>
+              <w:bottom w:type="dxa" w:w="70"/>
+              <w:right w:type="dxa" w:w="100"/>
+            </w:tcMar>
+          </w:tcPr>
+          <w:p>
+            <w:pPr>
+              <w:spacing w:after="40" w:line="260"/>
+            </w:pPr>
+            <w:r>
+              <w:rPr>
+                <w:sz w:val="19"/>
+                <w:szCs w:val="19"/>
+              </w:rPr>
+              <w:t xml:space="preserve">No password recovery, no lockout after failed attempts, one admin flag and no finer roles. Over plain HTTP the password, the session cookie and the ledger token can be read in transit.</w:t>
+            </w:r>
+          </w:p>
+        </w:tc>
+        <w:tc>
+          <w:tcPr>
+            <w:tcW w:type="dxa" w:w="3126"/>
+            <w:tcBorders>
+              <w:top w:val="single" w:color="C9D1DC" w:sz="4"/>
+              <w:left w:val="single" w:color="C9D1DC" w:sz="4"/>
+              <w:bottom w:val="single" w:color="C9D1DC" w:sz="4"/>
+              <w:right w:val="single" w:color="C9D1DC" w:sz="4"/>
+            </w:tcBorders>
+            <w:tcMar>
+              <w:top w:type="dxa" w:w="70"/>
+              <w:left w:type="dxa" w:w="100"/>
+              <w:bottom w:type="dxa" w:w="70"/>
+              <w:right w:type="dxa" w:w="100"/>
+            </w:tcMar>
+          </w:tcPr>
+          <w:p>
+            <w:pPr>
+              <w:spacing w:after="40" w:line="260"/>
+            </w:pPr>
+            <w:r>
+              <w:rPr>
+                <w:sz w:val="19"/>
+                <w:szCs w:val="19"/>
+              </w:rPr>
+              <w:t xml:space="preserve">Enough for accountability on one machine; run both services behind HTTPS before using them across a network</w:t>
+            </w:r>
+          </w:p>
+        </w:tc>
+      </w:tr>
+      <w:tr>
+        <w:trPr>
+          <w:cantSplit/>
+        </w:trPr>
+        <w:tc>
+          <w:tcPr>
+            <w:tcW w:type="dxa" w:w="2700"/>
+            <w:tcBorders>
+              <w:top w:val="single" w:color="C9D1DC" w:sz="4"/>
+              <w:left w:val="single" w:color="C9D1DC" w:sz="4"/>
+              <w:bottom w:val="single" w:color="C9D1DC" w:sz="4"/>
+              <w:right w:val="single" w:color="C9D1DC" w:sz="4"/>
+            </w:tcBorders>
+            <w:tcMar>
+              <w:top w:type="dxa" w:w="70"/>
+              <w:left w:type="dxa" w:w="100"/>
+              <w:bottom w:type="dxa" w:w="70"/>
+              <w:right w:type="dxa" w:w="100"/>
+            </w:tcMar>
+          </w:tcPr>
+          <w:p>
+            <w:pPr>
+              <w:spacing w:after="40" w:line="260"/>
+            </w:pPr>
+            <w:r>
+              <w:rPr>
+                <w:sz w:val="19"/>
+                <w:szCs w:val="19"/>
+              </w:rPr>
+              <w:t xml:space="preserve">A staff account is read as proof of truth</w:t>
+            </w:r>
+          </w:p>
+        </w:tc>
+        <w:tc>
+          <w:tcPr>
+            <w:tcW w:type="dxa" w:w="3200"/>
+            <w:tcBorders>
+              <w:top w:val="single" w:color="C9D1DC" w:sz="4"/>
+              <w:left w:val="single" w:color="C9D1DC" w:sz="4"/>
+              <w:bottom w:val="single" w:color="C9D1DC" w:sz="4"/>
+              <w:right w:val="single" w:color="C9D1DC" w:sz="4"/>
+            </w:tcBorders>
+            <w:tcMar>
+              <w:top w:type="dxa" w:w="70"/>
+              <w:left w:type="dxa" w:w="100"/>
+              <w:bottom w:type="dxa" w:w="70"/>
+              <w:right w:type="dxa" w:w="100"/>
+            </w:tcMar>
+          </w:tcPr>
+          <w:p>
+            <w:pPr>
+              <w:spacing w:after="40" w:line="260"/>
+            </w:pPr>
+            <w:r>
+              <w:rPr>
+                <w:sz w:val="19"/>
+                <w:szCs w:val="19"/>
+              </w:rPr>
+              <w:t xml:space="preserve">An account shows who confirmed a record. It does not show that what they confirmed is true.</w:t>
+            </w:r>
+          </w:p>
+        </w:tc>
+        <w:tc>
+          <w:tcPr>
+            <w:tcW w:type="dxa" w:w="3126"/>
+            <w:tcBorders>
+              <w:top w:val="single" w:color="C9D1DC" w:sz="4"/>
+              <w:left w:val="single" w:color="C9D1DC" w:sz="4"/>
+              <w:bottom w:val="single" w:color="C9D1DC" w:sz="4"/>
+              <w:right w:val="single" w:color="C9D1DC" w:sz="4"/>
+            </w:tcBorders>
+            <w:tcMar>
+              <w:top w:type="dxa" w:w="70"/>
+              <w:left w:type="dxa" w:w="100"/>
+              <w:bottom w:type="dxa" w:w="70"/>
+              <w:right w:type="dxa" w:w="100"/>
+            </w:tcMar>
+          </w:tcPr>
+          <w:p>
+            <w:pPr>
+              <w:spacing w:after="40" w:line="260"/>
+            </w:pPr>
+            <w:r>
+              <w:rPr>
+                <w:sz w:val="19"/>
+                <w:szCs w:val="19"/>
+              </w:rPr>
+              <w:t xml:space="preserve">Say so wherever sign-in is described; the trust model is unchanged</w:t>
+            </w:r>
+          </w:p>
+        </w:tc>
+      </w:tr>
+      <w:tr>
+        <w:trPr>
+          <w:cantSplit/>
+        </w:trPr>
+        <w:tc>
+          <w:tcPr>
+            <w:tcW w:type="dxa" w:w="2700"/>
+            <w:tcBorders>
+              <w:top w:val="single" w:color="C9D1DC" w:sz="4"/>
+              <w:left w:val="single" w:color="C9D1DC" w:sz="4"/>
+              <w:bottom w:val="single" w:color="C9D1DC" w:sz="4"/>
+              <w:right w:val="single" w:color="C9D1DC" w:sz="4"/>
+            </w:tcBorders>
+            <w:tcMar>
+              <w:top w:type="dxa" w:w="70"/>
+              <w:left w:type="dxa" w:w="100"/>
+              <w:bottom w:type="dxa" w:w="70"/>
+              <w:right w:type="dxa" w:w="100"/>
+            </w:tcMar>
+          </w:tcPr>
+          <w:p>
+            <w:pPr>
+              <w:spacing w:after="40" w:line="260"/>
+            </w:pPr>
+            <w:r>
+              <w:rPr>
+                <w:sz w:val="19"/>
+                <w:szCs w:val="19"/>
+              </w:rPr>
+              <w:t xml:space="preserve">Who confirmed, owns or sealed is edited in the database</w:t>
+            </w:r>
+          </w:p>
+        </w:tc>
+        <w:tc>
+          <w:tcPr>
+            <w:tcW w:type="dxa" w:w="3200"/>
+            <w:tcBorders>
+              <w:top w:val="single" w:color="C9D1DC" w:sz="4"/>
+              <w:left w:val="single" w:color="C9D1DC" w:sz="4"/>
+              <w:bottom w:val="single" w:color="C9D1DC" w:sz="4"/>
+              <w:right w:val="single" w:color="C9D1DC" w:sz="4"/>
+            </w:tcBorders>
+            <w:tcMar>
+              <w:top w:type="dxa" w:w="70"/>
+              <w:left w:type="dxa" w:w="100"/>
+              <w:bottom w:type="dxa" w:w="70"/>
+              <w:right w:type="dxa" w:w="100"/>
+            </w:tcMar>
+          </w:tcPr>
+          <w:p>
+            <w:pPr>
+              <w:spacing w:after="40" w:line="260"/>
+            </w:pPr>
+            <w:r>
+              <w:rPr>
+                <w:sz w:val="19"/>
+                <w:szCs w:val="19"/>
+              </w:rPr>
+              <w:t xml:space="preserve">These names are registry records only. They are not covered by the root, so the audit does not notice a change to them.</w:t>
+            </w:r>
+          </w:p>
+        </w:tc>
+        <w:tc>
+          <w:tcPr>
+            <w:tcW w:type="dxa" w:w="3126"/>
+            <w:tcBorders>
+              <w:top w:val="single" w:color="C9D1DC" w:sz="4"/>
+              <w:left w:val="single" w:color="C9D1DC" w:sz="4"/>
+              <w:bottom w:val="single" w:color="C9D1DC" w:sz="4"/>
+              <w:right w:val="single" w:color="C9D1DC" w:sz="4"/>
+            </w:tcBorders>
+            <w:tcMar>
+              <w:top w:type="dxa" w:w="70"/>
+              <w:left w:type="dxa" w:w="100"/>
+              <w:bottom w:type="dxa" w:w="70"/>
+              <w:right w:type="dxa" w:w="100"/>
+            </w:tcMar>
+          </w:tcPr>
+          <w:p>
+            <w:pPr>
+              <w:spacing w:after="40" w:line="260"/>
+            </w:pPr>
+            <w:r>
+              <w:rPr>
+                <w:sz w:val="19"/>
+                <w:szCs w:val="19"/>
+              </w:rPr>
+              <w:t xml:space="preserve">They are not part of any proof or verdict; the audit covers content, fingerprints and roots</w:t>
             </w:r>
           </w:p>
         </w:tc>
@@ -22562,7 +24831,7 @@
         <w:t xml:space="preserve">Register.</w:t>
       </w:r>
       <w:r>
-        <w:t xml:space="preserve"> Upload two or three documents. Show the fingerprint, the suggestions, and a person confirming them. To save time, </w:t>
+        <w:t xml:space="preserve"> Sign in, then upload two or three documents. Show the fingerprint, the suggestions, and a person confirming them under their own account. To save time, </w:t>
       </w:r>
       <w:r>
         <w:rPr>
@@ -22573,7 +24842,7 @@
         <w:t xml:space="preserve">python scripts/demo_seed.py</w:t>
       </w:r>
       <w:r>
-        <w:t xml:space="preserve"> prepares four sealed documents and leaves one waiting.</w:t>
+        <w:t xml:space="preserve"> prepares four sealed documents, leaves one waiting, and prints a demo account to sign in with.</w:t>
       </w:r>
     </w:p>
     <w:p>
@@ -22820,7 +25089,7 @@
         <w:t xml:space="preserve">python scripts/tamper.py restore</w:t>
       </w:r>
       <w:r>
-        <w:t xml:space="preserve"> puts the database back afterwards. Start the demo from empty data: the seed script refuses a database that already holds records.</w:t>
+        <w:t xml:space="preserve"> puts the database back afterwards. Start the demo from empty data: the seed script refuses a database that already holds records. Set the same ledger token in the terminals that run the ledger, the registry and the seed script.</w:t>
       </w:r>
     </w:p>
     <w:p>
@@ -23326,6 +25595,132 @@
                 <w:sz w:val="19"/>
                 <w:szCs w:val="19"/>
               </w:rPr>
+              <w:t xml:space="preserve">Who can register and seal records?</w:t>
+            </w:r>
+          </w:p>
+        </w:tc>
+        <w:tc>
+          <w:tcPr>
+            <w:tcW w:type="dxa" w:w="5926"/>
+            <w:tcBorders>
+              <w:top w:val="single" w:color="C9D1DC" w:sz="4"/>
+              <w:left w:val="single" w:color="C9D1DC" w:sz="4"/>
+              <w:bottom w:val="single" w:color="C9D1DC" w:sz="4"/>
+              <w:right w:val="single" w:color="C9D1DC" w:sz="4"/>
+            </w:tcBorders>
+            <w:tcMar>
+              <w:top w:type="dxa" w:w="70"/>
+              <w:left w:type="dxa" w:w="100"/>
+              <w:bottom w:type="dxa" w:w="70"/>
+              <w:right w:type="dxa" w:w="100"/>
+            </w:tcMar>
+          </w:tcPr>
+          <w:p>
+            <w:pPr>
+              <w:spacing w:after="40" w:line="260"/>
+            </w:pPr>
+            <w:r>
+              <w:rPr>
+                <w:sz w:val="19"/>
+                <w:szCs w:val="19"/>
+              </w:rPr>
+              <w:t xml:space="preserve">Staff with an account. Each confirmation and each seal names the account that made it, and a custodian seals only their own batch unless they are an admin. Verifying a document needs no account.</w:t>
+            </w:r>
+          </w:p>
+        </w:tc>
+      </w:tr>
+      <w:tr>
+        <w:trPr>
+          <w:cantSplit/>
+        </w:trPr>
+        <w:tc>
+          <w:tcPr>
+            <w:tcW w:type="dxa" w:w="3100"/>
+            <w:tcBorders>
+              <w:top w:val="single" w:color="C9D1DC" w:sz="4"/>
+              <w:left w:val="single" w:color="C9D1DC" w:sz="4"/>
+              <w:bottom w:val="single" w:color="C9D1DC" w:sz="4"/>
+              <w:right w:val="single" w:color="C9D1DC" w:sz="4"/>
+            </w:tcBorders>
+            <w:tcMar>
+              <w:top w:type="dxa" w:w="70"/>
+              <w:left w:type="dxa" w:w="100"/>
+              <w:bottom w:type="dxa" w:w="70"/>
+              <w:right w:type="dxa" w:w="100"/>
+            </w:tcMar>
+          </w:tcPr>
+          <w:p>
+            <w:pPr>
+              <w:spacing w:after="40" w:line="260"/>
+            </w:pPr>
+            <w:r>
+              <w:rPr>
+                <w:sz w:val="19"/>
+                <w:szCs w:val="19"/>
+              </w:rPr>
+              <w:t xml:space="preserve">Does signing in make the records more trustworthy?</w:t>
+            </w:r>
+          </w:p>
+        </w:tc>
+        <w:tc>
+          <w:tcPr>
+            <w:tcW w:type="dxa" w:w="5926"/>
+            <w:tcBorders>
+              <w:top w:val="single" w:color="C9D1DC" w:sz="4"/>
+              <w:left w:val="single" w:color="C9D1DC" w:sz="4"/>
+              <w:bottom w:val="single" w:color="C9D1DC" w:sz="4"/>
+              <w:right w:val="single" w:color="C9D1DC" w:sz="4"/>
+            </w:tcBorders>
+            <w:tcMar>
+              <w:top w:type="dxa" w:w="70"/>
+              <w:left w:type="dxa" w:w="100"/>
+              <w:bottom w:type="dxa" w:w="70"/>
+              <w:right w:type="dxa" w:w="100"/>
+            </w:tcMar>
+          </w:tcPr>
+          <w:p>
+            <w:pPr>
+              <w:spacing w:after="40" w:line="260"/>
+            </w:pPr>
+            <w:r>
+              <w:rPr>
+                <w:sz w:val="19"/>
+                <w:szCs w:val="19"/>
+              </w:rPr>
+              <w:t xml:space="preserve">No. It records who did what inside the registry. The guarantee still comes from the published root and the independent verifier, which hold even against someone who can edit the database file.</w:t>
+            </w:r>
+          </w:p>
+        </w:tc>
+      </w:tr>
+      <w:tr>
+        <w:trPr>
+          <w:cantSplit/>
+        </w:trPr>
+        <w:tc>
+          <w:tcPr>
+            <w:tcW w:type="dxa" w:w="3100"/>
+            <w:tcBorders>
+              <w:top w:val="single" w:color="C9D1DC" w:sz="4"/>
+              <w:left w:val="single" w:color="C9D1DC" w:sz="4"/>
+              <w:bottom w:val="single" w:color="C9D1DC" w:sz="4"/>
+              <w:right w:val="single" w:color="C9D1DC" w:sz="4"/>
+            </w:tcBorders>
+            <w:tcMar>
+              <w:top w:type="dxa" w:w="70"/>
+              <w:left w:type="dxa" w:w="100"/>
+              <w:bottom w:type="dxa" w:w="70"/>
+              <w:right w:type="dxa" w:w="100"/>
+            </w:tcMar>
+          </w:tcPr>
+          <w:p>
+            <w:pPr>
+              <w:spacing w:after="40" w:line="260"/>
+            </w:pPr>
+            <w:r>
+              <w:rPr>
+                <w:sz w:val="19"/>
+                <w:szCs w:val="19"/>
+              </w:rPr>
               <w:t xml:space="preserve">What if the registry database is wiped or rewritten?</w:t>
             </w:r>
           </w:p>
@@ -23356,6 +25751,69 @@
                 <w:szCs w:val="19"/>
               </w:rPr>
               <w:t xml:space="preserve">Holders still have their documents and proofs, and the ledger still has the roots. Verification keeps working without the registry.</w:t>
+            </w:r>
+          </w:p>
+        </w:tc>
+      </w:tr>
+      <w:tr>
+        <w:trPr>
+          <w:cantSplit/>
+        </w:trPr>
+        <w:tc>
+          <w:tcPr>
+            <w:tcW w:type="dxa" w:w="3100"/>
+            <w:tcBorders>
+              <w:top w:val="single" w:color="C9D1DC" w:sz="4"/>
+              <w:left w:val="single" w:color="C9D1DC" w:sz="4"/>
+              <w:bottom w:val="single" w:color="C9D1DC" w:sz="4"/>
+              <w:right w:val="single" w:color="C9D1DC" w:sz="4"/>
+            </w:tcBorders>
+            <w:tcMar>
+              <w:top w:type="dxa" w:w="70"/>
+              <w:left w:type="dxa" w:w="100"/>
+              <w:bottom w:type="dxa" w:w="70"/>
+              <w:right w:type="dxa" w:w="100"/>
+            </w:tcMar>
+          </w:tcPr>
+          <w:p>
+            <w:pPr>
+              <w:spacing w:after="40" w:line="260"/>
+            </w:pPr>
+            <w:r>
+              <w:rPr>
+                <w:sz w:val="19"/>
+                <w:szCs w:val="19"/>
+              </w:rPr>
+              <w:t xml:space="preserve">What if the same file is registered twice?</w:t>
+            </w:r>
+          </w:p>
+        </w:tc>
+        <w:tc>
+          <w:tcPr>
+            <w:tcW w:type="dxa" w:w="5926"/>
+            <w:tcBorders>
+              <w:top w:val="single" w:color="C9D1DC" w:sz="4"/>
+              <w:left w:val="single" w:color="C9D1DC" w:sz="4"/>
+              <w:bottom w:val="single" w:color="C9D1DC" w:sz="4"/>
+              <w:right w:val="single" w:color="C9D1DC" w:sz="4"/>
+            </w:tcBorders>
+            <w:tcMar>
+              <w:top w:type="dxa" w:w="70"/>
+              <w:left w:type="dxa" w:w="100"/>
+              <w:bottom w:type="dxa" w:w="70"/>
+              <w:right w:type="dxa" w:w="100"/>
+            </w:tcMar>
+          </w:tcPr>
+          <w:p>
+            <w:pPr>
+              <w:spacing w:after="40" w:line="260"/>
+            </w:pPr>
+            <w:r>
+              <w:rPr>
+                <w:sz w:val="19"/>
+                <w:szCs w:val="19"/>
+              </w:rPr>
+              <w:t xml:space="preserve">The fingerprint depends on content only, so the Register page warns and names the earlier record. If it is confirmed anyway, its own random salt makes it a separate leaf with a separate proof. The document verifies with either proof, because a pass means this content was registered, not which copy this is.</w:t>
             </w:r>
           </w:p>
         </w:tc>
@@ -23680,7 +26138,7 @@
                 <w:sz w:val="19"/>
                 <w:szCs w:val="19"/>
               </w:rPr>
-              <w:t xml:space="preserve">Leaf</w:t>
+              <w:t xml:space="preserve">Leaf value</w:t>
             </w:r>
           </w:p>
         </w:tc>
@@ -23709,7 +26167,7 @@
                 <w:sz w:val="19"/>
                 <w:szCs w:val="19"/>
               </w:rPr>
-              <w:t xml:space="preserve">Hash of a fingerprint with the 0x00 prefix; the bottom level of the tree</w:t>
+              <w:t xml:space="preserve">What a record contributes to the tree: its fingerprint, or in a salted batch the hash of its salt and fingerprint with the 0x02 prefix</w:t>
             </w:r>
           </w:p>
         </w:tc>
@@ -23743,7 +26201,7 @@
                 <w:sz w:val="19"/>
                 <w:szCs w:val="19"/>
               </w:rPr>
-              <w:t xml:space="preserve">Node</w:t>
+              <w:t xml:space="preserve">Salt</w:t>
             </w:r>
           </w:p>
         </w:tc>
@@ -23772,7 +26230,7 @@
                 <w:sz w:val="19"/>
                 <w:szCs w:val="19"/>
               </w:rPr>
-              <w:t xml:space="preserve">Hash of two child hashes with the 0x01 prefix</w:t>
+              <w:t xml:space="preserve">A random 32-byte value given to each record at upload, so that every registration is a distinct leaf</w:t>
             </w:r>
           </w:p>
         </w:tc>
@@ -23806,7 +26264,7 @@
                 <w:sz w:val="19"/>
                 <w:szCs w:val="19"/>
               </w:rPr>
-              <w:t xml:space="preserve">Root</w:t>
+              <w:t xml:space="preserve">Leaf</w:t>
             </w:r>
           </w:p>
         </w:tc>
@@ -23835,7 +26293,7 @@
                 <w:sz w:val="19"/>
                 <w:szCs w:val="19"/>
               </w:rPr>
-              <w:t xml:space="preserve">The single hash at the top of a Merkle tree; commits to the whole batch</w:t>
+              <w:t xml:space="preserve">Hash of a leaf value with the 0x00 prefix; the bottom level of the tree</w:t>
             </w:r>
           </w:p>
         </w:tc>
@@ -23869,6 +26327,132 @@
                 <w:sz w:val="19"/>
                 <w:szCs w:val="19"/>
               </w:rPr>
+              <w:t xml:space="preserve">Node</w:t>
+            </w:r>
+          </w:p>
+        </w:tc>
+        <w:tc>
+          <w:tcPr>
+            <w:tcW w:type="dxa" w:w="6726"/>
+            <w:tcBorders>
+              <w:top w:val="single" w:color="C9D1DC" w:sz="4"/>
+              <w:left w:val="single" w:color="C9D1DC" w:sz="4"/>
+              <w:bottom w:val="single" w:color="C9D1DC" w:sz="4"/>
+              <w:right w:val="single" w:color="C9D1DC" w:sz="4"/>
+            </w:tcBorders>
+            <w:tcMar>
+              <w:top w:type="dxa" w:w="70"/>
+              <w:left w:type="dxa" w:w="100"/>
+              <w:bottom w:type="dxa" w:w="70"/>
+              <w:right w:type="dxa" w:w="100"/>
+            </w:tcMar>
+          </w:tcPr>
+          <w:p>
+            <w:pPr>
+              <w:spacing w:after="40" w:line="260"/>
+            </w:pPr>
+            <w:r>
+              <w:rPr>
+                <w:sz w:val="19"/>
+                <w:szCs w:val="19"/>
+              </w:rPr>
+              <w:t xml:space="preserve">Hash of two child hashes with the 0x01 prefix</w:t>
+            </w:r>
+          </w:p>
+        </w:tc>
+      </w:tr>
+      <w:tr>
+        <w:trPr>
+          <w:cantSplit/>
+        </w:trPr>
+        <w:tc>
+          <w:tcPr>
+            <w:tcW w:type="dxa" w:w="2300"/>
+            <w:tcBorders>
+              <w:top w:val="single" w:color="C9D1DC" w:sz="4"/>
+              <w:left w:val="single" w:color="C9D1DC" w:sz="4"/>
+              <w:bottom w:val="single" w:color="C9D1DC" w:sz="4"/>
+              <w:right w:val="single" w:color="C9D1DC" w:sz="4"/>
+            </w:tcBorders>
+            <w:tcMar>
+              <w:top w:type="dxa" w:w="70"/>
+              <w:left w:type="dxa" w:w="100"/>
+              <w:bottom w:type="dxa" w:w="70"/>
+              <w:right w:type="dxa" w:w="100"/>
+            </w:tcMar>
+          </w:tcPr>
+          <w:p>
+            <w:pPr>
+              <w:spacing w:after="40" w:line="260"/>
+            </w:pPr>
+            <w:r>
+              <w:rPr>
+                <w:sz w:val="19"/>
+                <w:szCs w:val="19"/>
+              </w:rPr>
+              <w:t xml:space="preserve">Root</w:t>
+            </w:r>
+          </w:p>
+        </w:tc>
+        <w:tc>
+          <w:tcPr>
+            <w:tcW w:type="dxa" w:w="6726"/>
+            <w:tcBorders>
+              <w:top w:val="single" w:color="C9D1DC" w:sz="4"/>
+              <w:left w:val="single" w:color="C9D1DC" w:sz="4"/>
+              <w:bottom w:val="single" w:color="C9D1DC" w:sz="4"/>
+              <w:right w:val="single" w:color="C9D1DC" w:sz="4"/>
+            </w:tcBorders>
+            <w:tcMar>
+              <w:top w:type="dxa" w:w="70"/>
+              <w:left w:type="dxa" w:w="100"/>
+              <w:bottom w:type="dxa" w:w="70"/>
+              <w:right w:type="dxa" w:w="100"/>
+            </w:tcMar>
+          </w:tcPr>
+          <w:p>
+            <w:pPr>
+              <w:spacing w:after="40" w:line="260"/>
+            </w:pPr>
+            <w:r>
+              <w:rPr>
+                <w:sz w:val="19"/>
+                <w:szCs w:val="19"/>
+              </w:rPr>
+              <w:t xml:space="preserve">The single hash at the top of a Merkle tree; commits to the whole batch</w:t>
+            </w:r>
+          </w:p>
+        </w:tc>
+      </w:tr>
+      <w:tr>
+        <w:trPr>
+          <w:cantSplit/>
+        </w:trPr>
+        <w:tc>
+          <w:tcPr>
+            <w:tcW w:type="dxa" w:w="2300"/>
+            <w:tcBorders>
+              <w:top w:val="single" w:color="C9D1DC" w:sz="4"/>
+              <w:left w:val="single" w:color="C9D1DC" w:sz="4"/>
+              <w:bottom w:val="single" w:color="C9D1DC" w:sz="4"/>
+              <w:right w:val="single" w:color="C9D1DC" w:sz="4"/>
+            </w:tcBorders>
+            <w:tcMar>
+              <w:top w:type="dxa" w:w="70"/>
+              <w:left w:type="dxa" w:w="100"/>
+              <w:bottom w:type="dxa" w:w="70"/>
+              <w:right w:type="dxa" w:w="100"/>
+            </w:tcMar>
+          </w:tcPr>
+          <w:p>
+            <w:pPr>
+              <w:spacing w:after="40" w:line="260"/>
+            </w:pPr>
+            <w:r>
+              <w:rPr>
+                <w:sz w:val="19"/>
+                <w:szCs w:val="19"/>
+              </w:rPr>
               <w:t xml:space="preserve">Batch</w:t>
             </w:r>
           </w:p>
@@ -23899,6 +26483,258 @@
                 <w:szCs w:val="19"/>
               </w:rPr>
               <w:t xml:space="preserve">A group of records sealed together under one root</w:t>
+            </w:r>
+          </w:p>
+        </w:tc>
+      </w:tr>
+      <w:tr>
+        <w:trPr>
+          <w:cantSplit/>
+        </w:trPr>
+        <w:tc>
+          <w:tcPr>
+            <w:tcW w:type="dxa" w:w="2300"/>
+            <w:tcBorders>
+              <w:top w:val="single" w:color="C9D1DC" w:sz="4"/>
+              <w:left w:val="single" w:color="C9D1DC" w:sz="4"/>
+              <w:bottom w:val="single" w:color="C9D1DC" w:sz="4"/>
+              <w:right w:val="single" w:color="C9D1DC" w:sz="4"/>
+            </w:tcBorders>
+            <w:tcMar>
+              <w:top w:type="dxa" w:w="70"/>
+              <w:left w:type="dxa" w:w="100"/>
+              <w:bottom w:type="dxa" w:w="70"/>
+              <w:right w:type="dxa" w:w="100"/>
+            </w:tcMar>
+          </w:tcPr>
+          <w:p>
+            <w:pPr>
+              <w:spacing w:after="40" w:line="260"/>
+            </w:pPr>
+            <w:r>
+              <w:rPr>
+                <w:sz w:val="19"/>
+                <w:szCs w:val="19"/>
+              </w:rPr>
+              <w:t xml:space="preserve">Custodian</w:t>
+            </w:r>
+          </w:p>
+        </w:tc>
+        <w:tc>
+          <w:tcPr>
+            <w:tcW w:type="dxa" w:w="6726"/>
+            <w:tcBorders>
+              <w:top w:val="single" w:color="C9D1DC" w:sz="4"/>
+              <w:left w:val="single" w:color="C9D1DC" w:sz="4"/>
+              <w:bottom w:val="single" w:color="C9D1DC" w:sz="4"/>
+              <w:right w:val="single" w:color="C9D1DC" w:sz="4"/>
+            </w:tcBorders>
+            <w:tcMar>
+              <w:top w:type="dxa" w:w="70"/>
+              <w:left w:type="dxa" w:w="100"/>
+              <w:bottom w:type="dxa" w:w="70"/>
+              <w:right w:type="dxa" w:w="100"/>
+            </w:tcMar>
+          </w:tcPr>
+          <w:p>
+            <w:pPr>
+              <w:spacing w:after="40" w:line="260"/>
+            </w:pPr>
+            <w:r>
+              <w:rPr>
+                <w:sz w:val="19"/>
+                <w:szCs w:val="19"/>
+              </w:rPr>
+              <w:t xml:space="preserve">A member of staff with an account on the registry, who registers and confirms records</w:t>
+            </w:r>
+          </w:p>
+        </w:tc>
+      </w:tr>
+      <w:tr>
+        <w:trPr>
+          <w:cantSplit/>
+        </w:trPr>
+        <w:tc>
+          <w:tcPr>
+            <w:tcW w:type="dxa" w:w="2300"/>
+            <w:tcBorders>
+              <w:top w:val="single" w:color="C9D1DC" w:sz="4"/>
+              <w:left w:val="single" w:color="C9D1DC" w:sz="4"/>
+              <w:bottom w:val="single" w:color="C9D1DC" w:sz="4"/>
+              <w:right w:val="single" w:color="C9D1DC" w:sz="4"/>
+            </w:tcBorders>
+            <w:tcMar>
+              <w:top w:type="dxa" w:w="70"/>
+              <w:left w:type="dxa" w:w="100"/>
+              <w:bottom w:type="dxa" w:w="70"/>
+              <w:right w:type="dxa" w:w="100"/>
+            </w:tcMar>
+          </w:tcPr>
+          <w:p>
+            <w:pPr>
+              <w:spacing w:after="40" w:line="260"/>
+            </w:pPr>
+            <w:r>
+              <w:rPr>
+                <w:sz w:val="19"/>
+                <w:szCs w:val="19"/>
+              </w:rPr>
+              <w:t xml:space="preserve">Batch owner</w:t>
+            </w:r>
+          </w:p>
+        </w:tc>
+        <w:tc>
+          <w:tcPr>
+            <w:tcW w:type="dxa" w:w="6726"/>
+            <w:tcBorders>
+              <w:top w:val="single" w:color="C9D1DC" w:sz="4"/>
+              <w:left w:val="single" w:color="C9D1DC" w:sz="4"/>
+              <w:bottom w:val="single" w:color="C9D1DC" w:sz="4"/>
+              <w:right w:val="single" w:color="C9D1DC" w:sz="4"/>
+            </w:tcBorders>
+            <w:tcMar>
+              <w:top w:type="dxa" w:w="70"/>
+              <w:left w:type="dxa" w:w="100"/>
+              <w:bottom w:type="dxa" w:w="70"/>
+              <w:right w:type="dxa" w:w="100"/>
+            </w:tcMar>
+          </w:tcPr>
+          <w:p>
+            <w:pPr>
+              <w:spacing w:after="40" w:line="260"/>
+            </w:pPr>
+            <w:r>
+              <w:rPr>
+                <w:sz w:val="19"/>
+                <w:szCs w:val="19"/>
+              </w:rPr>
+              <w:t xml:space="preserve">The custodian whose confirmations fill a batch, and who seals it</w:t>
+            </w:r>
+          </w:p>
+        </w:tc>
+      </w:tr>
+      <w:tr>
+        <w:trPr>
+          <w:cantSplit/>
+        </w:trPr>
+        <w:tc>
+          <w:tcPr>
+            <w:tcW w:type="dxa" w:w="2300"/>
+            <w:tcBorders>
+              <w:top w:val="single" w:color="C9D1DC" w:sz="4"/>
+              <w:left w:val="single" w:color="C9D1DC" w:sz="4"/>
+              <w:bottom w:val="single" w:color="C9D1DC" w:sz="4"/>
+              <w:right w:val="single" w:color="C9D1DC" w:sz="4"/>
+            </w:tcBorders>
+            <w:tcMar>
+              <w:top w:type="dxa" w:w="70"/>
+              <w:left w:type="dxa" w:w="100"/>
+              <w:bottom w:type="dxa" w:w="70"/>
+              <w:right w:type="dxa" w:w="100"/>
+            </w:tcMar>
+          </w:tcPr>
+          <w:p>
+            <w:pPr>
+              <w:spacing w:after="40" w:line="260"/>
+            </w:pPr>
+            <w:r>
+              <w:rPr>
+                <w:sz w:val="19"/>
+                <w:szCs w:val="19"/>
+              </w:rPr>
+              <w:t xml:space="preserve">Admin</w:t>
+            </w:r>
+          </w:p>
+        </w:tc>
+        <w:tc>
+          <w:tcPr>
+            <w:tcW w:type="dxa" w:w="6726"/>
+            <w:tcBorders>
+              <w:top w:val="single" w:color="C9D1DC" w:sz="4"/>
+              <w:left w:val="single" w:color="C9D1DC" w:sz="4"/>
+              <w:bottom w:val="single" w:color="C9D1DC" w:sz="4"/>
+              <w:right w:val="single" w:color="C9D1DC" w:sz="4"/>
+            </w:tcBorders>
+            <w:tcMar>
+              <w:top w:type="dxa" w:w="70"/>
+              <w:left w:type="dxa" w:w="100"/>
+              <w:bottom w:type="dxa" w:w="70"/>
+              <w:right w:type="dxa" w:w="100"/>
+            </w:tcMar>
+          </w:tcPr>
+          <w:p>
+            <w:pPr>
+              <w:spacing w:after="40" w:line="260"/>
+            </w:pPr>
+            <w:r>
+              <w:rPr>
+                <w:sz w:val="19"/>
+                <w:szCs w:val="19"/>
+              </w:rPr>
+              <w:t xml:space="preserve">An account that may seal any custodian's open batch</w:t>
+            </w:r>
+          </w:p>
+        </w:tc>
+      </w:tr>
+      <w:tr>
+        <w:trPr>
+          <w:cantSplit/>
+        </w:trPr>
+        <w:tc>
+          <w:tcPr>
+            <w:tcW w:type="dxa" w:w="2300"/>
+            <w:tcBorders>
+              <w:top w:val="single" w:color="C9D1DC" w:sz="4"/>
+              <w:left w:val="single" w:color="C9D1DC" w:sz="4"/>
+              <w:bottom w:val="single" w:color="C9D1DC" w:sz="4"/>
+              <w:right w:val="single" w:color="C9D1DC" w:sz="4"/>
+            </w:tcBorders>
+            <w:tcMar>
+              <w:top w:type="dxa" w:w="70"/>
+              <w:left w:type="dxa" w:w="100"/>
+              <w:bottom w:type="dxa" w:w="70"/>
+              <w:right w:type="dxa" w:w="100"/>
+            </w:tcMar>
+          </w:tcPr>
+          <w:p>
+            <w:pPr>
+              <w:spacing w:after="40" w:line="260"/>
+            </w:pPr>
+            <w:r>
+              <w:rPr>
+                <w:sz w:val="19"/>
+                <w:szCs w:val="19"/>
+              </w:rPr>
+              <w:t xml:space="preserve">Ledger token</w:t>
+            </w:r>
+          </w:p>
+        </w:tc>
+        <w:tc>
+          <w:tcPr>
+            <w:tcW w:type="dxa" w:w="6726"/>
+            <w:tcBorders>
+              <w:top w:val="single" w:color="C9D1DC" w:sz="4"/>
+              <w:left w:val="single" w:color="C9D1DC" w:sz="4"/>
+              <w:bottom w:val="single" w:color="C9D1DC" w:sz="4"/>
+              <w:right w:val="single" w:color="C9D1DC" w:sz="4"/>
+            </w:tcBorders>
+            <w:tcMar>
+              <w:top w:type="dxa" w:w="70"/>
+              <w:left w:type="dxa" w:w="100"/>
+              <w:bottom w:type="dxa" w:w="70"/>
+              <w:right w:type="dxa" w:w="100"/>
+            </w:tcMar>
+          </w:tcPr>
+          <w:p>
+            <w:pPr>
+              <w:spacing w:after="40" w:line="260"/>
+            </w:pPr>
+            <w:r>
+              <w:rPr>
+                <w:sz w:val="19"/>
+                <w:szCs w:val="19"/>
+              </w:rPr>
+              <w:t xml:space="preserve">The shared secret the registry presents to the ledger when it appends a root</w:t>
             </w:r>
           </w:p>
         </w:tc>

</xml_diff>